<commit_message>
fix: Añadir controlador de transacciones con validación atómica de existencias
</commit_message>
<xml_diff>
--- a/docs/Informe de Practica Ejecución de Mantenimiento.docx
+++ b/docs/Informe de Practica Ejecución de Mantenimiento.docx
@@ -238,22 +238,14 @@
         <w:rPr>
           <w:rFonts w:ascii="Times New Roman" w:hAnsi="Times New Roman" w:cs="Times New Roman"/>
         </w:rPr>
-        <w:t xml:space="preserve">PRÁCTICA </w:t>
-      </w:r>
-      <w:proofErr w:type="gramStart"/>
+        <w:t xml:space="preserve">PRÁCTICA No.  </w:t>
+      </w:r>
       <w:r>
         <w:rPr>
           <w:rFonts w:ascii="Times New Roman" w:hAnsi="Times New Roman" w:cs="Times New Roman"/>
         </w:rPr>
-        <w:t xml:space="preserve">No.  </w:t>
-      </w:r>
-      <w:r>
-        <w:rPr>
-          <w:rFonts w:ascii="Times New Roman" w:hAnsi="Times New Roman" w:cs="Times New Roman"/>
-        </w:rPr>
         <w:t>2</w:t>
       </w:r>
-      <w:proofErr w:type="gramEnd"/>
     </w:p>
     <w:p>
       <w:pPr>
@@ -340,14 +332,12 @@
         </w:rPr>
         <w:t xml:space="preserve">                   </w:t>
       </w:r>
-      <w:proofErr w:type="spellStart"/>
       <w:r>
         <w:rPr>
           <w:b/>
         </w:rPr>
         <w:t>CODIGO</w:t>
       </w:r>
-      <w:proofErr w:type="spellEnd"/>
       <w:r>
         <w:rPr>
           <w:b/>
@@ -670,13 +660,6 @@
           <w:bCs/>
         </w:rPr>
         <w:tab/>
-      </w:r>
-      <w:proofErr w:type="spellStart"/>
-      <w:r>
-        <w:rPr>
-          <w:b/>
-          <w:bCs/>
-        </w:rPr>
         <w:t>ESPECÍF</w:t>
       </w:r>
       <w:r>
@@ -693,7 +676,6 @@
         </w:rPr>
         <w:t>COS</w:t>
       </w:r>
-      <w:proofErr w:type="spellEnd"/>
     </w:p>
     <w:p>
       <w:pPr>
@@ -742,25 +724,7 @@
           <w:sz w:val="24"/>
           <w:szCs w:val="24"/>
         </w:rPr>
-        <w:t xml:space="preserve">Adaptar la infraestructura de persistencia y los protocolos de seguridad del </w:t>
-      </w:r>
-      <w:proofErr w:type="spellStart"/>
-      <w:r>
-        <w:rPr>
-          <w:rFonts w:ascii="Times New Roman" w:hAnsi="Times New Roman"/>
-          <w:sz w:val="24"/>
-          <w:szCs w:val="24"/>
-        </w:rPr>
-        <w:t>frontend</w:t>
-      </w:r>
-      <w:proofErr w:type="spellEnd"/>
-      <w:r>
-        <w:rPr>
-          <w:rFonts w:ascii="Times New Roman" w:hAnsi="Times New Roman"/>
-          <w:sz w:val="24"/>
-          <w:szCs w:val="24"/>
-        </w:rPr>
-        <w:t xml:space="preserve"> para permitir el despliegue del sistema en entornos de nube y producción.</w:t>
+        <w:t>Adaptar la infraestructura de persistencia y los protocolos de seguridad del frontend para permitir el despliegue del sistema en entornos de nube y producción.</w:t>
       </w:r>
     </w:p>
     <w:p>
@@ -991,23 +955,7 @@
           <w:b/>
           <w:bCs/>
         </w:rPr>
-        <w:t xml:space="preserve">MARCO </w:t>
-      </w:r>
-      <w:proofErr w:type="spellStart"/>
-      <w:r>
-        <w:rPr>
-          <w:b/>
-          <w:bCs/>
-        </w:rPr>
-        <w:t>TEORICO</w:t>
-      </w:r>
-      <w:proofErr w:type="spellEnd"/>
-      <w:r>
-        <w:rPr>
-          <w:b/>
-          <w:bCs/>
-        </w:rPr>
-        <w:t>:</w:t>
+        <w:t>MARCO TEORICO:</w:t>
       </w:r>
     </w:p>
     <w:p>
@@ -1090,21 +1038,7 @@
         <w:rPr>
           <w:lang w:val="es-EC"/>
         </w:rPr>
-        <w:t xml:space="preserve">El análisis técnico se rige por los principios de diseño modular esenciales en el desarrollo de software moderno. La cohesión funcional representa el grado de responsabilidad única dentro de los controladores del </w:t>
-      </w:r>
-      <w:proofErr w:type="spellStart"/>
-      <w:r>
-        <w:rPr>
-          <w:lang w:val="es-EC"/>
-        </w:rPr>
-        <w:t>backend</w:t>
-      </w:r>
-      <w:proofErr w:type="spellEnd"/>
-      <w:r>
-        <w:rPr>
-          <w:lang w:val="es-EC"/>
-        </w:rPr>
-        <w:t xml:space="preserve">, donde se busca que cada componente gestione una sola entidad de negocio para facilitar su testeo y mantenimiento. </w:t>
+        <w:t xml:space="preserve">El análisis técnico se rige por los principios de diseño modular esenciales en el desarrollo de software moderno. La cohesión funcional representa el grado de responsabilidad única dentro de los controladores del backend, donde se busca que cada componente gestione una sola entidad de negocio para facilitar su testeo y mantenimiento. </w:t>
       </w:r>
     </w:p>
     <w:p>
@@ -1153,21 +1087,7 @@
         <w:rPr>
           <w:lang w:val="es-EC"/>
         </w:rPr>
-        <w:t xml:space="preserve">El soporte teórico para la gestión de datos se basa en el modelado eficiente mediante el uso de esquemas de </w:t>
-      </w:r>
-      <w:proofErr w:type="spellStart"/>
-      <w:r>
-        <w:rPr>
-          <w:lang w:val="es-EC"/>
-        </w:rPr>
-        <w:t>Mongoose</w:t>
-      </w:r>
-      <w:proofErr w:type="spellEnd"/>
-      <w:r>
-        <w:rPr>
-          <w:lang w:val="es-EC"/>
-        </w:rPr>
-        <w:t xml:space="preserve"> en un entorno NoSQL. </w:t>
+        <w:t xml:space="preserve">El soporte teórico para la gestión de datos se basa en el modelado eficiente mediante el uso de esquemas de Mongoose en un entorno NoSQL. </w:t>
       </w:r>
     </w:p>
     <w:p>
@@ -1335,21 +1255,7 @@
         <w:rPr>
           <w:lang w:val="es-EC"/>
         </w:rPr>
-        <w:t xml:space="preserve"> Optimización del middleware auth.js para la validación de identidad mediante tokens </w:t>
-      </w:r>
-      <w:proofErr w:type="spellStart"/>
-      <w:r>
-        <w:rPr>
-          <w:lang w:val="es-EC"/>
-        </w:rPr>
-        <w:t>JWT</w:t>
-      </w:r>
-      <w:proofErr w:type="spellEnd"/>
-      <w:r>
-        <w:rPr>
-          <w:lang w:val="es-EC"/>
-        </w:rPr>
-        <w:t xml:space="preserve"> y gestión de roles de usuario.</w:t>
+        <w:t xml:space="preserve"> Optimización del middleware auth.js para la validación de identidad mediante tokens JWT y gestión de roles de usuario.</w:t>
       </w:r>
     </w:p>
     <w:p>
@@ -1397,23 +1303,13 @@
           <w:lang w:val="es-EC"/>
         </w:rPr>
       </w:pPr>
-      <w:proofErr w:type="spellStart"/>
-      <w:r>
-        <w:rPr>
-          <w:b/>
-          <w:bCs/>
-          <w:lang w:val="es-EC"/>
-        </w:rPr>
-        <w:t>Documentacion</w:t>
-      </w:r>
-      <w:proofErr w:type="spellEnd"/>
-      <w:r>
-        <w:rPr>
-          <w:b/>
-          <w:bCs/>
-          <w:lang w:val="es-EC"/>
-        </w:rPr>
-        <w:t>:</w:t>
+      <w:r>
+        <w:rPr>
+          <w:b/>
+          <w:bCs/>
+          <w:lang w:val="es-EC"/>
+        </w:rPr>
+        <w:t>Documentacion:</w:t>
       </w:r>
       <w:r>
         <w:rPr>
@@ -1431,15 +1327,7 @@
         <w:t xml:space="preserve">los </w:t>
       </w:r>
       <w:r>
-        <w:t xml:space="preserve">modelos de datos basados en los esquemas de </w:t>
-      </w:r>
-      <w:proofErr w:type="spellStart"/>
-      <w:r>
-        <w:t>Mongoose</w:t>
-      </w:r>
-      <w:proofErr w:type="spellEnd"/>
-      <w:r>
-        <w:t>, asegurando coherencia con la implementación actual.</w:t>
+        <w:t>modelos de datos basados en los esquemas de Mongoose, asegurando coherencia con la implementación actual.</w:t>
       </w:r>
     </w:p>
     <w:p>
@@ -1503,7 +1391,6 @@
           <w:szCs w:val="24"/>
         </w:rPr>
       </w:pPr>
-      <w:proofErr w:type="spellStart"/>
       <w:r>
         <w:rPr>
           <w:rFonts w:ascii="Times New Roman" w:hAnsi="Times New Roman"/>
@@ -1512,18 +1399,7 @@
           <w:sz w:val="24"/>
           <w:szCs w:val="24"/>
         </w:rPr>
-        <w:t>JWT</w:t>
-      </w:r>
-      <w:proofErr w:type="spellEnd"/>
-      <w:r>
-        <w:rPr>
-          <w:rFonts w:ascii="Times New Roman" w:hAnsi="Times New Roman"/>
-          <w:b/>
-          <w:bCs/>
-          <w:sz w:val="24"/>
-          <w:szCs w:val="24"/>
-        </w:rPr>
-        <w:t xml:space="preserve"> (JSON Web Token)</w:t>
+        <w:t>JWT (JSON Web Token)</w:t>
       </w:r>
       <w:r>
         <w:rPr>
@@ -1548,7 +1424,6 @@
           <w:szCs w:val="24"/>
         </w:rPr>
       </w:pPr>
-      <w:proofErr w:type="spellStart"/>
       <w:r>
         <w:rPr>
           <w:rFonts w:ascii="Times New Roman" w:hAnsi="Times New Roman"/>
@@ -1560,32 +1435,13 @@
         <w:lastRenderedPageBreak/>
         <w:t>Mongoose</w:t>
       </w:r>
-      <w:proofErr w:type="spellEnd"/>
       <w:r>
         <w:rPr>
           <w:rFonts w:ascii="Times New Roman" w:hAnsi="Times New Roman"/>
           <w:sz w:val="24"/>
           <w:szCs w:val="24"/>
         </w:rPr>
-        <w:t xml:space="preserve">: Biblioteca </w:t>
-      </w:r>
-      <w:proofErr w:type="spellStart"/>
-      <w:r>
-        <w:rPr>
-          <w:rFonts w:ascii="Times New Roman" w:hAnsi="Times New Roman"/>
-          <w:sz w:val="24"/>
-          <w:szCs w:val="24"/>
-        </w:rPr>
-        <w:t>ODM</w:t>
-      </w:r>
-      <w:proofErr w:type="spellEnd"/>
-      <w:r>
-        <w:rPr>
-          <w:rFonts w:ascii="Times New Roman" w:hAnsi="Times New Roman"/>
-          <w:sz w:val="24"/>
-          <w:szCs w:val="24"/>
-        </w:rPr>
-        <w:t xml:space="preserve"> empleada para el modelado y gestión de esquemas en la base de datos NoSQL.</w:t>
+        <w:t>: Biblioteca ODM empleada para el modelado y gestión de esquemas en la base de datos NoSQL.</w:t>
       </w:r>
     </w:p>
     <w:p>
@@ -1608,71 +1464,31 @@
     <w:p>
       <w:pPr>
         <w:ind w:left="708"/>
-        <w:rPr>
-          <w:lang w:val="es-EC"/>
-        </w:rPr>
-      </w:pPr>
-      <w:r>
-        <w:rPr>
-          <w:lang w:val="es-EC"/>
-        </w:rPr>
-        <w:t xml:space="preserve">Se integran las guías de modelado de </w:t>
-      </w:r>
-      <w:proofErr w:type="spellStart"/>
-      <w:r>
-        <w:rPr>
-          <w:lang w:val="es-EC"/>
-        </w:rPr>
-        <w:t>Mongoose</w:t>
-      </w:r>
-      <w:proofErr w:type="spellEnd"/>
-      <w:r>
-        <w:rPr>
-          <w:lang w:val="es-EC"/>
-        </w:rPr>
-        <w:t xml:space="preserve"> para la gestión de persistencia en la base de datos NoSQL y los estándares de </w:t>
-      </w:r>
-      <w:proofErr w:type="spellStart"/>
-      <w:r>
-        <w:rPr>
-          <w:lang w:val="es-EC"/>
-        </w:rPr>
-        <w:t>React</w:t>
-      </w:r>
-      <w:proofErr w:type="spellEnd"/>
-      <w:r>
-        <w:rPr>
-          <w:lang w:val="es-EC"/>
-        </w:rPr>
-        <w:t xml:space="preserve"> para el desarrollo de la interfaz y consumo de servicios.</w:t>
+        <w:jc w:val="both"/>
+        <w:rPr>
+          <w:lang w:val="es-EC"/>
+        </w:rPr>
+      </w:pPr>
+      <w:r>
+        <w:rPr>
+          <w:lang w:val="es-EC"/>
+        </w:rPr>
+        <w:t>Se integran las guías de modelado de Mongoose para la gestión de persistencia en la base de datos NoSQL y los estándares de React para el desarrollo de la interfaz y consumo de servicios.</w:t>
       </w:r>
     </w:p>
     <w:p>
       <w:pPr>
         <w:ind w:left="708"/>
-        <w:rPr>
-          <w:lang w:val="es-EC"/>
-        </w:rPr>
-      </w:pPr>
-      <w:r>
-        <w:rPr>
-          <w:lang w:val="es-EC"/>
-        </w:rPr>
-        <w:t>En materia de seguridad, el proceso de autenticación se rige por el estándar RFC 7519 correspondiente a los JSON Web Tokens (</w:t>
-      </w:r>
-      <w:proofErr w:type="spellStart"/>
-      <w:r>
-        <w:rPr>
-          <w:lang w:val="es-EC"/>
-        </w:rPr>
-        <w:t>JWT</w:t>
-      </w:r>
-      <w:proofErr w:type="spellEnd"/>
-      <w:r>
-        <w:rPr>
-          <w:lang w:val="es-EC"/>
-        </w:rPr>
-        <w:t>). Asimismo, la reestructuración de controladores y modelos se fundamenta en los principios de arquitectura modular, priorizando la cohesión funcional y el desacoplamiento para garantizar la escalabilidad del sistema</w:t>
+        <w:jc w:val="both"/>
+        <w:rPr>
+          <w:lang w:val="es-EC"/>
+        </w:rPr>
+      </w:pPr>
+      <w:r>
+        <w:rPr>
+          <w:lang w:val="es-EC"/>
+        </w:rPr>
+        <w:t>En materia de seguridad, el proceso de autenticación se rige por el estándar RFC 7519 correspondiente a los JSON Web Tokens (JWT). Asimismo, la reestructuración de controladores y modelos se fundamenta en los principios de arquitectura modular, priorizando la cohesión funcional y el desacoplamiento para garantizar la escalabilidad del sistema</w:t>
       </w:r>
     </w:p>
     <w:p>
@@ -1712,6 +1528,7 @@
     <w:p>
       <w:pPr>
         <w:ind w:left="708"/>
+        <w:jc w:val="both"/>
       </w:pPr>
       <w:r>
         <w:t>La plataforma constituye una solución integral para la gestión de inventarios y el seguimiento sistemático de transacciones comerciales, desarrollada bajo un enfoque de aplicaciones web de alto rendimiento. Su funcionalidad primordial es la administración atómica de existencias y el registro detallado de movimientos de productos, con el objetivo de garantizar la consistencia de la información y proveer analíticas operativas precisas para la toma de decisiones.</w:t>
@@ -1844,21 +1661,7 @@
         <w:rPr>
           <w:lang w:val="es-EC"/>
         </w:rPr>
-        <w:t xml:space="preserve">: Ejecución en Node.js con soporte de </w:t>
-      </w:r>
-      <w:proofErr w:type="spellStart"/>
-      <w:r>
-        <w:rPr>
-          <w:lang w:val="es-EC"/>
-        </w:rPr>
-        <w:t>nodemon</w:t>
-      </w:r>
-      <w:proofErr w:type="spellEnd"/>
-      <w:r>
-        <w:rPr>
-          <w:lang w:val="es-EC"/>
-        </w:rPr>
-        <w:t xml:space="preserve"> para depuración en tiempo real.</w:t>
+        <w:t>: Ejecución en Node.js con soporte de nodemon para depuración en tiempo real.</w:t>
       </w:r>
     </w:p>
     <w:p>
@@ -1936,21 +1739,7 @@
         <w:rPr>
           <w:lang w:val="es-EC"/>
         </w:rPr>
-        <w:t xml:space="preserve">: Empleo del </w:t>
-      </w:r>
-      <w:proofErr w:type="spellStart"/>
-      <w:r>
-        <w:rPr>
-          <w:lang w:val="es-EC"/>
-        </w:rPr>
-        <w:t>framework</w:t>
-      </w:r>
-      <w:proofErr w:type="spellEnd"/>
-      <w:r>
-        <w:rPr>
-          <w:lang w:val="es-EC"/>
-        </w:rPr>
-        <w:t xml:space="preserve"> </w:t>
+        <w:t xml:space="preserve">: Empleo del framework </w:t>
       </w:r>
       <w:r>
         <w:rPr>
@@ -1999,153 +1788,6 @@
     </w:p>
     <w:p>
       <w:pPr>
-        <w:ind w:left="1068"/>
-        <w:rPr>
-          <w:b/>
-          <w:bCs/>
-          <w:lang w:val="es-EC"/>
-        </w:rPr>
-      </w:pPr>
-      <w:r>
-        <w:rPr>
-          <w:b/>
-          <w:bCs/>
-          <w:lang w:val="es-EC"/>
-        </w:rPr>
-        <w:lastRenderedPageBreak/>
-        <w:t>Producción</w:t>
-      </w:r>
-    </w:p>
-    <w:p>
-      <w:pPr>
-        <w:numPr>
-          <w:ilvl w:val="0"/>
-          <w:numId w:val="20"/>
-        </w:numPr>
-        <w:tabs>
-          <w:tab w:val="clear" w:pos="720"/>
-          <w:tab w:val="num" w:pos="1788"/>
-        </w:tabs>
-        <w:ind w:left="1788"/>
-        <w:rPr>
-          <w:lang w:val="es-EC"/>
-        </w:rPr>
-      </w:pPr>
-      <w:r>
-        <w:rPr>
-          <w:b/>
-          <w:bCs/>
-          <w:lang w:val="es-EC"/>
-        </w:rPr>
-        <w:t>Estrategia</w:t>
-      </w:r>
-      <w:r>
-        <w:rPr>
-          <w:lang w:val="es-EC"/>
-        </w:rPr>
-        <w:t xml:space="preserve">: Despliegue basado en microservicios contenerizados con </w:t>
-      </w:r>
-      <w:r>
-        <w:rPr>
-          <w:b/>
-          <w:bCs/>
-          <w:lang w:val="es-EC"/>
-        </w:rPr>
-        <w:t>Docker</w:t>
-      </w:r>
-      <w:r>
-        <w:rPr>
-          <w:lang w:val="es-EC"/>
-        </w:rPr>
-        <w:t xml:space="preserve"> y </w:t>
-      </w:r>
-      <w:r>
-        <w:rPr>
-          <w:b/>
-          <w:bCs/>
-          <w:lang w:val="es-EC"/>
-        </w:rPr>
-        <w:t xml:space="preserve">Docker </w:t>
-      </w:r>
-      <w:proofErr w:type="spellStart"/>
-      <w:r>
-        <w:rPr>
-          <w:b/>
-          <w:bCs/>
-          <w:lang w:val="es-EC"/>
-        </w:rPr>
-        <w:t>Compose</w:t>
-      </w:r>
-      <w:proofErr w:type="spellEnd"/>
-      <w:r>
-        <w:rPr>
-          <w:lang w:val="es-EC"/>
-        </w:rPr>
-        <w:t>.</w:t>
-      </w:r>
-    </w:p>
-    <w:p>
-      <w:pPr>
-        <w:numPr>
-          <w:ilvl w:val="0"/>
-          <w:numId w:val="20"/>
-        </w:numPr>
-        <w:tabs>
-          <w:tab w:val="clear" w:pos="720"/>
-          <w:tab w:val="num" w:pos="1788"/>
-        </w:tabs>
-        <w:ind w:left="1788"/>
-        <w:rPr>
-          <w:lang w:val="es-EC"/>
-        </w:rPr>
-      </w:pPr>
-      <w:r>
-        <w:rPr>
-          <w:b/>
-          <w:bCs/>
-          <w:lang w:val="es-EC"/>
-        </w:rPr>
-        <w:t>Optimización</w:t>
-      </w:r>
-      <w:r>
-        <w:rPr>
-          <w:lang w:val="es-EC"/>
-        </w:rPr>
-        <w:t xml:space="preserve">: Servidor </w:t>
-      </w:r>
-      <w:proofErr w:type="spellStart"/>
-      <w:r>
-        <w:rPr>
-          <w:b/>
-          <w:bCs/>
-          <w:lang w:val="es-EC"/>
-        </w:rPr>
-        <w:t>Nginx</w:t>
-      </w:r>
-      <w:proofErr w:type="spellEnd"/>
-      <w:r>
-        <w:rPr>
-          <w:lang w:val="es-EC"/>
-        </w:rPr>
-        <w:t xml:space="preserve"> para la gestión de activos del </w:t>
-      </w:r>
-      <w:proofErr w:type="spellStart"/>
-      <w:r>
-        <w:rPr>
-          <w:lang w:val="es-EC"/>
-        </w:rPr>
-        <w:t>frontend</w:t>
-      </w:r>
-      <w:proofErr w:type="spellEnd"/>
-      <w:r>
-        <w:rPr>
-          <w:lang w:val="es-EC"/>
-        </w:rPr>
-        <w:t xml:space="preserve"> y conexión a clústeres de base de datos en la nube.</w:t>
-      </w:r>
-    </w:p>
-    <w:p>
-      <w:pPr>
         <w:ind w:left="708"/>
         <w:outlineLvl w:val="1"/>
         <w:rPr>
@@ -2158,6 +1800,7 @@
           <w:b/>
           <w:bCs/>
         </w:rPr>
+        <w:lastRenderedPageBreak/>
         <w:t>3. Tipos de Mantenimiento</w:t>
       </w:r>
     </w:p>
@@ -2197,21 +1840,7 @@
         <w:rPr>
           <w:lang w:val="es-EC"/>
         </w:rPr>
-        <w:t xml:space="preserve">Intervención en la función </w:t>
-      </w:r>
-      <w:proofErr w:type="spellStart"/>
-      <w:r>
-        <w:rPr>
-          <w:lang w:val="es-EC"/>
-        </w:rPr>
-        <w:t>createTransaction</w:t>
-      </w:r>
-      <w:proofErr w:type="spellEnd"/>
-      <w:r>
-        <w:rPr>
-          <w:lang w:val="es-EC"/>
-        </w:rPr>
-        <w:t xml:space="preserve"> dentro de TransactionController.js para asegurar que la entrada y salida de productos se valide atómicamente antes de su persistencia.</w:t>
+        <w:t>Intervención en la función createTransaction dentro de TransactionController.js para asegurar que la entrada y salida de productos se valide atómicamente antes de su persistencia.</w:t>
       </w:r>
     </w:p>
     <w:p>
@@ -2255,21 +1884,7 @@
         <w:rPr>
           <w:lang w:val="es-EC"/>
         </w:rPr>
-        <w:t xml:space="preserve">Ajuste del componente Dashboard.js para manejar estados de carga y errores asíncronos en las llamadas paralelas de </w:t>
-      </w:r>
-      <w:proofErr w:type="spellStart"/>
-      <w:r>
-        <w:rPr>
-          <w:lang w:val="es-EC"/>
-        </w:rPr>
-        <w:t>Promise.all</w:t>
-      </w:r>
-      <w:proofErr w:type="spellEnd"/>
-      <w:r>
-        <w:rPr>
-          <w:lang w:val="es-EC"/>
-        </w:rPr>
-        <w:t>, evitando que la interfaz colapse ante respuestas vacías de la API.</w:t>
+        <w:t>Ajuste del componente Dashboard.js para manejar estados de carga y errores asíncronos en las llamadas paralelas de Promise.all, evitando que la interfaz colapse ante respuestas vacías de la API.</w:t>
       </w:r>
     </w:p>
     <w:p>
@@ -2303,21 +1918,7 @@
         <w:rPr>
           <w:lang w:val="es-EC"/>
         </w:rPr>
-        <w:t xml:space="preserve">Modificación de dbConnection.js para </w:t>
-      </w:r>
-      <w:proofErr w:type="spellStart"/>
-      <w:r>
-        <w:rPr>
-          <w:lang w:val="es-EC"/>
-        </w:rPr>
-        <w:t>transicionar</w:t>
-      </w:r>
-      <w:proofErr w:type="spellEnd"/>
-      <w:r>
-        <w:rPr>
-          <w:lang w:val="es-EC"/>
-        </w:rPr>
-        <w:t xml:space="preserve"> de una cadena de conexión estática a una configuración basada en variables de entorno dinámicas, facilitando el despliegue en MongoDB Atlas.</w:t>
+        <w:t>Modificación de dbConnection.js para transicionar de una cadena de conexión estática a una configuración basada en variables de entorno dinámicas, facilitando el despliegue en MongoDB Atlas.</w:t>
       </w:r>
     </w:p>
     <w:p>
@@ -2334,63 +1935,7 @@
         <w:rPr>
           <w:lang w:val="es-EC"/>
         </w:rPr>
-        <w:t xml:space="preserve">Actualización de los servicios en </w:t>
-      </w:r>
-      <w:proofErr w:type="spellStart"/>
-      <w:r>
-        <w:rPr>
-          <w:lang w:val="es-EC"/>
-        </w:rPr>
-        <w:t>frontend</w:t>
-      </w:r>
-      <w:proofErr w:type="spellEnd"/>
-      <w:r>
-        <w:rPr>
-          <w:lang w:val="es-EC"/>
-        </w:rPr>
-        <w:t>/</w:t>
-      </w:r>
-      <w:proofErr w:type="spellStart"/>
-      <w:r>
-        <w:rPr>
-          <w:lang w:val="es-EC"/>
-        </w:rPr>
-        <w:t>src</w:t>
-      </w:r>
-      <w:proofErr w:type="spellEnd"/>
-      <w:r>
-        <w:rPr>
-          <w:lang w:val="es-EC"/>
-        </w:rPr>
-        <w:t>/</w:t>
-      </w:r>
-      <w:proofErr w:type="spellStart"/>
-      <w:r>
-        <w:rPr>
-          <w:lang w:val="es-EC"/>
-        </w:rPr>
-        <w:t>services</w:t>
-      </w:r>
-      <w:proofErr w:type="spellEnd"/>
-      <w:r>
-        <w:rPr>
-          <w:lang w:val="es-EC"/>
-        </w:rPr>
-        <w:t xml:space="preserve">/api.js para adaptarse a políticas estrictas de CORS y protocolos SSL/TLS en servidores de producción como </w:t>
-      </w:r>
-      <w:proofErr w:type="spellStart"/>
-      <w:r>
-        <w:rPr>
-          <w:lang w:val="es-EC"/>
-        </w:rPr>
-        <w:t>Nginx</w:t>
-      </w:r>
-      <w:proofErr w:type="spellEnd"/>
-      <w:r>
-        <w:rPr>
-          <w:lang w:val="es-EC"/>
-        </w:rPr>
-        <w:t>.</w:t>
+        <w:t>Actualización de los servicios en frontend/src/services/api.js para adaptarse a políticas estrictas de CORS y protocolos SSL/TLS en servidores de producción como Nginx.</w:t>
       </w:r>
     </w:p>
     <w:p>
@@ -2429,35 +1974,7 @@
         <w:rPr>
           <w:lang w:val="es-EC"/>
         </w:rPr>
-        <w:t xml:space="preserve">Implementación de índices secundarios en ProductModel.js (ej. en los campos </w:t>
-      </w:r>
-      <w:proofErr w:type="spellStart"/>
-      <w:r>
-        <w:rPr>
-          <w:lang w:val="es-EC"/>
-        </w:rPr>
-        <w:t>category</w:t>
-      </w:r>
-      <w:proofErr w:type="spellEnd"/>
-      <w:r>
-        <w:rPr>
-          <w:lang w:val="es-EC"/>
-        </w:rPr>
-        <w:t xml:space="preserve"> y </w:t>
-      </w:r>
-      <w:proofErr w:type="spellStart"/>
-      <w:r>
-        <w:rPr>
-          <w:lang w:val="es-EC"/>
-        </w:rPr>
-        <w:t>price</w:t>
-      </w:r>
-      <w:proofErr w:type="spellEnd"/>
-      <w:r>
-        <w:rPr>
-          <w:lang w:val="es-EC"/>
-        </w:rPr>
-        <w:t>) para reducir la latencia en búsquedas dentro de catálogos extensos.</w:t>
+        <w:t>Implementación de índices secundarios en ProductModel.js (ej. en los campos category y price) para reducir la latencia en búsquedas dentro de catálogos extensos.</w:t>
       </w:r>
     </w:p>
     <w:p>
@@ -2501,35 +2018,7 @@
         <w:rPr>
           <w:lang w:val="es-EC"/>
         </w:rPr>
-        <w:t xml:space="preserve">Optimización de las funciones de agregación en los controladores de </w:t>
-      </w:r>
-      <w:proofErr w:type="spellStart"/>
-      <w:r>
-        <w:rPr>
-          <w:lang w:val="es-EC"/>
-        </w:rPr>
-        <w:t>backend</w:t>
-      </w:r>
-      <w:proofErr w:type="spellEnd"/>
-      <w:r>
-        <w:rPr>
-          <w:lang w:val="es-EC"/>
-        </w:rPr>
-        <w:t xml:space="preserve"> para reducir el consumo de recursos de CPU durante la generación de métricas del </w:t>
-      </w:r>
-      <w:proofErr w:type="spellStart"/>
-      <w:r>
-        <w:rPr>
-          <w:lang w:val="es-EC"/>
-        </w:rPr>
-        <w:t>Dashboard</w:t>
-      </w:r>
-      <w:proofErr w:type="spellEnd"/>
-      <w:r>
-        <w:rPr>
-          <w:lang w:val="es-EC"/>
-        </w:rPr>
-        <w:t>.</w:t>
+        <w:t>Optimización de las funciones de agregación en los controladores de backend para reducir el consumo de recursos de CPU durante la generación de métricas del Dashboard.</w:t>
       </w:r>
     </w:p>
     <w:p>
@@ -2575,7 +2064,6 @@
         <w:rPr>
           <w:lang w:val="es-EC"/>
         </w:rPr>
-        <w:lastRenderedPageBreak/>
         <w:t>Reestructuración de controladores como TransactionController.js para separar las responsabilidades de validación de la lógica de persistencia, cumpliendo con principios de diseño sólido.</w:t>
       </w:r>
     </w:p>
@@ -2598,6 +2086,7 @@
         <w:rPr>
           <w:lang w:val="es-EC"/>
         </w:rPr>
+        <w:lastRenderedPageBreak/>
         <w:t>Fortalecimiento de las capas de middleware y servicios para que la lógica de negocio sea independiente de la implementación técnica de la API, previniendo errores en cascada ante cambios futuros.</w:t>
       </w:r>
     </w:p>
@@ -2674,35 +2163,7 @@
         <w:rPr>
           <w:lang w:val="es-EC"/>
         </w:rPr>
-        <w:t xml:space="preserve">: </w:t>
-      </w:r>
-      <w:proofErr w:type="spellStart"/>
-      <w:r>
-        <w:rPr>
-          <w:lang w:val="es-EC"/>
-        </w:rPr>
-        <w:t>backend</w:t>
-      </w:r>
-      <w:proofErr w:type="spellEnd"/>
-      <w:r>
-        <w:rPr>
-          <w:lang w:val="es-EC"/>
-        </w:rPr>
-        <w:t>/</w:t>
-      </w:r>
-      <w:proofErr w:type="spellStart"/>
-      <w:r>
-        <w:rPr>
-          <w:lang w:val="es-EC"/>
-        </w:rPr>
-        <w:t>controllers</w:t>
-      </w:r>
-      <w:proofErr w:type="spellEnd"/>
-      <w:r>
-        <w:rPr>
-          <w:lang w:val="es-EC"/>
-        </w:rPr>
-        <w:t>/TransactionController.js y OrderController.js.</w:t>
+        <w:t>: backend/controllers/TransactionController.js y OrderController.js.</w:t>
       </w:r>
     </w:p>
     <w:p>
@@ -2730,21 +2191,7 @@
         <w:rPr>
           <w:lang w:val="es-EC"/>
         </w:rPr>
-        <w:t xml:space="preserve">: Middleware de autenticación y autorización en </w:t>
-      </w:r>
-      <w:proofErr w:type="spellStart"/>
-      <w:r>
-        <w:rPr>
-          <w:lang w:val="es-EC"/>
-        </w:rPr>
-        <w:t>backend</w:t>
-      </w:r>
-      <w:proofErr w:type="spellEnd"/>
-      <w:r>
-        <w:rPr>
-          <w:lang w:val="es-EC"/>
-        </w:rPr>
-        <w:t>/middleware/auth.js.</w:t>
+        <w:t>: Middleware de autenticación y autorización en backend/middleware/auth.js.</w:t>
       </w:r>
     </w:p>
     <w:p>
@@ -2772,63 +2219,7 @@
         <w:rPr>
           <w:lang w:val="es-EC"/>
         </w:rPr>
-        <w:t xml:space="preserve">: Esquemas de datos en </w:t>
-      </w:r>
-      <w:proofErr w:type="spellStart"/>
-      <w:r>
-        <w:rPr>
-          <w:lang w:val="es-EC"/>
-        </w:rPr>
-        <w:t>backend</w:t>
-      </w:r>
-      <w:proofErr w:type="spellEnd"/>
-      <w:r>
-        <w:rPr>
-          <w:lang w:val="es-EC"/>
-        </w:rPr>
-        <w:t>/</w:t>
-      </w:r>
-      <w:proofErr w:type="spellStart"/>
-      <w:r>
-        <w:rPr>
-          <w:lang w:val="es-EC"/>
-        </w:rPr>
-        <w:t>models</w:t>
-      </w:r>
-      <w:proofErr w:type="spellEnd"/>
-      <w:r>
-        <w:rPr>
-          <w:lang w:val="es-EC"/>
-        </w:rPr>
-        <w:t xml:space="preserve">/ProductModel.js y configuración de enlace en </w:t>
-      </w:r>
-      <w:proofErr w:type="spellStart"/>
-      <w:r>
-        <w:rPr>
-          <w:lang w:val="es-EC"/>
-        </w:rPr>
-        <w:t>backend</w:t>
-      </w:r>
-      <w:proofErr w:type="spellEnd"/>
-      <w:r>
-        <w:rPr>
-          <w:lang w:val="es-EC"/>
-        </w:rPr>
-        <w:t>/</w:t>
-      </w:r>
-      <w:proofErr w:type="spellStart"/>
-      <w:r>
-        <w:rPr>
-          <w:lang w:val="es-EC"/>
-        </w:rPr>
-        <w:t>config</w:t>
-      </w:r>
-      <w:proofErr w:type="spellEnd"/>
-      <w:r>
-        <w:rPr>
-          <w:lang w:val="es-EC"/>
-        </w:rPr>
-        <w:t>/dbConnection.js.</w:t>
+        <w:t>: Esquemas de datos en backend/models/ProductModel.js y configuración de enlace en backend/config/dbConnection.js.</w:t>
       </w:r>
     </w:p>
     <w:p>
@@ -2856,91 +2247,7 @@
         <w:rPr>
           <w:lang w:val="es-EC"/>
         </w:rPr>
-        <w:t xml:space="preserve">: Tablero de control principal en </w:t>
-      </w:r>
-      <w:proofErr w:type="spellStart"/>
-      <w:r>
-        <w:rPr>
-          <w:lang w:val="es-EC"/>
-        </w:rPr>
-        <w:t>frontend</w:t>
-      </w:r>
-      <w:proofErr w:type="spellEnd"/>
-      <w:r>
-        <w:rPr>
-          <w:lang w:val="es-EC"/>
-        </w:rPr>
-        <w:t>/</w:t>
-      </w:r>
-      <w:proofErr w:type="spellStart"/>
-      <w:r>
-        <w:rPr>
-          <w:lang w:val="es-EC"/>
-        </w:rPr>
-        <w:t>src</w:t>
-      </w:r>
-      <w:proofErr w:type="spellEnd"/>
-      <w:r>
-        <w:rPr>
-          <w:lang w:val="es-EC"/>
-        </w:rPr>
-        <w:t>/</w:t>
-      </w:r>
-      <w:proofErr w:type="spellStart"/>
-      <w:r>
-        <w:rPr>
-          <w:lang w:val="es-EC"/>
-        </w:rPr>
-        <w:t>pages</w:t>
-      </w:r>
-      <w:proofErr w:type="spellEnd"/>
-      <w:r>
-        <w:rPr>
-          <w:lang w:val="es-EC"/>
-        </w:rPr>
-        <w:t xml:space="preserve">/Dashboard.js y servicios de API en </w:t>
-      </w:r>
-      <w:proofErr w:type="spellStart"/>
-      <w:r>
-        <w:rPr>
-          <w:lang w:val="es-EC"/>
-        </w:rPr>
-        <w:t>frontend</w:t>
-      </w:r>
-      <w:proofErr w:type="spellEnd"/>
-      <w:r>
-        <w:rPr>
-          <w:lang w:val="es-EC"/>
-        </w:rPr>
-        <w:t>/</w:t>
-      </w:r>
-      <w:proofErr w:type="spellStart"/>
-      <w:r>
-        <w:rPr>
-          <w:lang w:val="es-EC"/>
-        </w:rPr>
-        <w:t>src</w:t>
-      </w:r>
-      <w:proofErr w:type="spellEnd"/>
-      <w:r>
-        <w:rPr>
-          <w:lang w:val="es-EC"/>
-        </w:rPr>
-        <w:t>/</w:t>
-      </w:r>
-      <w:proofErr w:type="spellStart"/>
-      <w:r>
-        <w:rPr>
-          <w:lang w:val="es-EC"/>
-        </w:rPr>
-        <w:t>services</w:t>
-      </w:r>
-      <w:proofErr w:type="spellEnd"/>
-      <w:r>
-        <w:rPr>
-          <w:lang w:val="es-EC"/>
-        </w:rPr>
-        <w:t>/api.js.</w:t>
+        <w:t>: Tablero de control principal en frontend/src/pages/Dashboard.js y servicios de API en frontend/src/services/api.js.</w:t>
       </w:r>
     </w:p>
     <w:p>
@@ -2968,49 +2275,7 @@
         <w:rPr>
           <w:lang w:val="es-EC"/>
         </w:rPr>
-        <w:t xml:space="preserve">: Archivos de orquestación </w:t>
-      </w:r>
-      <w:proofErr w:type="spellStart"/>
-      <w:r>
-        <w:rPr>
-          <w:lang w:val="es-EC"/>
-        </w:rPr>
-        <w:t>docker-compose.yml</w:t>
-      </w:r>
-      <w:proofErr w:type="spellEnd"/>
-      <w:r>
-        <w:rPr>
-          <w:lang w:val="es-EC"/>
-        </w:rPr>
-        <w:t xml:space="preserve"> y configuración de servidor </w:t>
-      </w:r>
-      <w:proofErr w:type="spellStart"/>
-      <w:r>
-        <w:rPr>
-          <w:lang w:val="es-EC"/>
-        </w:rPr>
-        <w:t>frontend</w:t>
-      </w:r>
-      <w:proofErr w:type="spellEnd"/>
-      <w:r>
-        <w:rPr>
-          <w:lang w:val="es-EC"/>
-        </w:rPr>
-        <w:t>/</w:t>
-      </w:r>
-      <w:proofErr w:type="spellStart"/>
-      <w:r>
-        <w:rPr>
-          <w:lang w:val="es-EC"/>
-        </w:rPr>
-        <w:t>nginx.conf</w:t>
-      </w:r>
-      <w:proofErr w:type="spellEnd"/>
-      <w:r>
-        <w:rPr>
-          <w:lang w:val="es-EC"/>
-        </w:rPr>
-        <w:t>.</w:t>
+        <w:t>: Archivos de orquestación docker-compose.yml y configuración de servidor frontend/nginx.conf.</w:t>
       </w:r>
     </w:p>
     <w:p>
@@ -3072,7 +2337,7 @@
             </w:pPr>
             <w:r>
               <w:rPr>
-                <w:rStyle w:val="Textoennegrita"/>
+                <w:rStyle w:val="Fuerte"/>
                 <w:rFonts w:ascii="Times New Roman" w:hAnsi="Times New Roman" w:cs="Times New Roman"/>
               </w:rPr>
               <w:t>Área de Intervención</w:t>
@@ -3093,7 +2358,7 @@
             </w:pPr>
             <w:r>
               <w:rPr>
-                <w:rStyle w:val="Textoennegrita"/>
+                <w:rStyle w:val="Fuerte"/>
                 <w:rFonts w:ascii="Times New Roman" w:hAnsi="Times New Roman" w:cs="Times New Roman"/>
               </w:rPr>
               <w:t>Severidad</w:t>
@@ -3115,7 +2380,7 @@
             </w:pPr>
             <w:r>
               <w:rPr>
-                <w:rStyle w:val="Textoennegrita"/>
+                <w:rStyle w:val="Fuerte"/>
                 <w:rFonts w:ascii="Times New Roman" w:hAnsi="Times New Roman" w:cs="Times New Roman"/>
               </w:rPr>
               <w:t>Impacto</w:t>
@@ -3136,7 +2401,7 @@
             </w:pPr>
             <w:r>
               <w:rPr>
-                <w:rStyle w:val="Textoennegrita"/>
+                <w:rStyle w:val="Fuerte"/>
                 <w:rFonts w:ascii="Times New Roman" w:hAnsi="Times New Roman" w:cs="Times New Roman"/>
               </w:rPr>
               <w:t>Urgencia</w:t>
@@ -3157,7 +2422,7 @@
             </w:pPr>
             <w:r>
               <w:rPr>
-                <w:rStyle w:val="Textoennegrita"/>
+                <w:rStyle w:val="Fuerte"/>
                 <w:rFonts w:ascii="Times New Roman" w:hAnsi="Times New Roman" w:cs="Times New Roman"/>
               </w:rPr>
               <w:t>Justificación Técnica</w:t>
@@ -3352,7 +2617,6 @@
                 <w:b/>
                 <w:bCs/>
               </w:rPr>
-              <w:lastRenderedPageBreak/>
               <w:t>Conectividad (dbConnection.js)</w:t>
             </w:r>
           </w:p>
@@ -3434,6 +2698,7 @@
                 <w:b/>
                 <w:bCs/>
               </w:rPr>
+              <w:lastRenderedPageBreak/>
               <w:t>Optimización (ProductModel.js)</w:t>
             </w:r>
           </w:p>
@@ -3590,37 +2855,8 @@
         <w:rPr>
           <w:lang w:val="es-EC"/>
         </w:rPr>
-        <w:t xml:space="preserve">: Implementación de configuraciones dinámicas para secretos de </w:t>
-      </w:r>
-      <w:proofErr w:type="spellStart"/>
-      <w:r>
-        <w:rPr>
-          <w:lang w:val="es-EC"/>
-        </w:rPr>
-        <w:t>JWT</w:t>
-      </w:r>
-      <w:proofErr w:type="spellEnd"/>
-      <w:r>
-        <w:rPr>
-          <w:lang w:val="es-EC"/>
-        </w:rPr>
-        <w:t xml:space="preserve"> y </w:t>
-      </w:r>
-      <w:proofErr w:type="spellStart"/>
-      <w:r>
-        <w:rPr>
-          <w:lang w:val="es-EC"/>
-        </w:rPr>
-        <w:t>URIs</w:t>
-      </w:r>
-      <w:proofErr w:type="spellEnd"/>
-      <w:r>
-        <w:rPr>
-          <w:lang w:val="es-EC"/>
-        </w:rPr>
-        <w:t xml:space="preserve"> de base de datos, evitando el </w:t>
-      </w:r>
-      <w:proofErr w:type="spellStart"/>
+        <w:t xml:space="preserve">: Implementación de configuraciones dinámicas para secretos de JWT y URIs de base de datos, evitando el </w:t>
+      </w:r>
       <w:r>
         <w:rPr>
           <w:i/>
@@ -3629,7 +2865,6 @@
         </w:rPr>
         <w:t>hardcoding</w:t>
       </w:r>
-      <w:proofErr w:type="spellEnd"/>
       <w:r>
         <w:rPr>
           <w:lang w:val="es-EC"/>
@@ -3666,7 +2901,6 @@
         </w:rPr>
         <w:t xml:space="preserve">: Uso de </w:t>
       </w:r>
-      <w:proofErr w:type="spellStart"/>
       <w:r>
         <w:rPr>
           <w:b/>
@@ -3675,7 +2909,6 @@
         </w:rPr>
         <w:t>ESLint</w:t>
       </w:r>
-      <w:proofErr w:type="spellEnd"/>
       <w:r>
         <w:rPr>
           <w:lang w:val="es-EC"/>
@@ -3704,18 +2937,8 @@
           <w:bCs/>
           <w:lang w:val="es-EC"/>
         </w:rPr>
-        <w:t xml:space="preserve">Seguridad </w:t>
-      </w:r>
-      <w:proofErr w:type="spellStart"/>
-      <w:r>
-        <w:rPr>
-          <w:b/>
-          <w:bCs/>
-          <w:lang w:val="es-EC"/>
-        </w:rPr>
-        <w:t>JWT</w:t>
-      </w:r>
-      <w:proofErr w:type="spellEnd"/>
+        <w:t>Seguridad JWT</w:t>
+      </w:r>
       <w:r>
         <w:rPr>
           <w:lang w:val="es-EC"/>
@@ -3795,21 +3018,7 @@
         <w:rPr>
           <w:lang w:val="es-EC"/>
         </w:rPr>
-        <w:t xml:space="preserve">: Ejecutadas mediante el </w:t>
-      </w:r>
-      <w:proofErr w:type="spellStart"/>
-      <w:r>
-        <w:rPr>
-          <w:lang w:val="es-EC"/>
-        </w:rPr>
-        <w:t>framework</w:t>
-      </w:r>
-      <w:proofErr w:type="spellEnd"/>
-      <w:r>
-        <w:rPr>
-          <w:lang w:val="es-EC"/>
-        </w:rPr>
-        <w:t xml:space="preserve"> </w:t>
+        <w:t xml:space="preserve">: Ejecutadas mediante el framework </w:t>
       </w:r>
       <w:r>
         <w:rPr>
@@ -3919,35 +3128,7 @@
         <w:rPr>
           <w:lang w:val="es-EC"/>
         </w:rPr>
-        <w:t xml:space="preserve">El </w:t>
-      </w:r>
-      <w:proofErr w:type="spellStart"/>
-      <w:r>
-        <w:rPr>
-          <w:lang w:val="es-EC"/>
-        </w:rPr>
-        <w:t>Dashboard</w:t>
-      </w:r>
-      <w:proofErr w:type="spellEnd"/>
-      <w:r>
-        <w:rPr>
-          <w:lang w:val="es-EC"/>
-        </w:rPr>
-        <w:t xml:space="preserve"> debe renderizar estados de carga y </w:t>
-      </w:r>
-      <w:proofErr w:type="spellStart"/>
-      <w:r>
-        <w:rPr>
-          <w:lang w:val="es-EC"/>
-        </w:rPr>
-        <w:t>fallbacks</w:t>
-      </w:r>
-      <w:proofErr w:type="spellEnd"/>
-      <w:r>
-        <w:rPr>
-          <w:lang w:val="es-EC"/>
-        </w:rPr>
-        <w:t xml:space="preserve"> visuales ante respuestas vacías de la API sin generar errores de consola.</w:t>
+        <w:t>El Dashboard debe renderizar estados de carga y fallbacks visuales ante respuestas vacías de la API sin generar errores de consola.</w:t>
       </w:r>
     </w:p>
     <w:p>
@@ -3971,7 +3152,6 @@
           <w:b/>
           <w:bCs/>
         </w:rPr>
-        <w:lastRenderedPageBreak/>
         <w:t>4.5 Despliegue</w:t>
       </w:r>
     </w:p>
@@ -3986,21 +3166,7 @@
         <w:rPr>
           <w:lang w:val="es-EC"/>
         </w:rPr>
-        <w:t xml:space="preserve">El procedimiento de puesta en producción tras el mantenimiento sigue un flujo de </w:t>
-      </w:r>
-      <w:proofErr w:type="spellStart"/>
-      <w:r>
-        <w:rPr>
-          <w:lang w:val="es-EC"/>
-        </w:rPr>
-        <w:t>contenerización</w:t>
-      </w:r>
-      <w:proofErr w:type="spellEnd"/>
-      <w:r>
-        <w:rPr>
-          <w:lang w:val="es-EC"/>
-        </w:rPr>
-        <w:t xml:space="preserve"> estandarizado:</w:t>
+        <w:t>El procedimiento de puesta en producción tras el mantenimiento sigue un flujo de contenerización estandarizado:</w:t>
       </w:r>
     </w:p>
     <w:p>
@@ -4024,55 +3190,14 @@
           <w:bCs/>
           <w:lang w:val="es-EC"/>
         </w:rPr>
+        <w:lastRenderedPageBreak/>
         <w:t>Construcción de Imágenes</w:t>
       </w:r>
       <w:r>
         <w:rPr>
           <w:lang w:val="es-EC"/>
         </w:rPr>
-        <w:t xml:space="preserve">: Generación de imágenes Docker independientes para el </w:t>
-      </w:r>
-      <w:proofErr w:type="spellStart"/>
-      <w:r>
-        <w:rPr>
-          <w:lang w:val="es-EC"/>
-        </w:rPr>
-        <w:t>backend</w:t>
-      </w:r>
-      <w:proofErr w:type="spellEnd"/>
-      <w:r>
-        <w:rPr>
-          <w:lang w:val="es-EC"/>
-        </w:rPr>
-        <w:t xml:space="preserve"> (Node.js) y el </w:t>
-      </w:r>
-      <w:proofErr w:type="spellStart"/>
-      <w:r>
-        <w:rPr>
-          <w:lang w:val="es-EC"/>
-        </w:rPr>
-        <w:t>frontend</w:t>
-      </w:r>
-      <w:proofErr w:type="spellEnd"/>
-      <w:r>
-        <w:rPr>
-          <w:lang w:val="es-EC"/>
-        </w:rPr>
-        <w:t xml:space="preserve"> (</w:t>
-      </w:r>
-      <w:proofErr w:type="spellStart"/>
-      <w:r>
-        <w:rPr>
-          <w:lang w:val="es-EC"/>
-        </w:rPr>
-        <w:t>Nginx</w:t>
-      </w:r>
-      <w:proofErr w:type="spellEnd"/>
-      <w:r>
-        <w:rPr>
-          <w:lang w:val="es-EC"/>
-        </w:rPr>
-        <w:t>).</w:t>
+        <w:t>: Generación de imágenes Docker independientes para el backend (Node.js) y el frontend (Nginx).</w:t>
       </w:r>
     </w:p>
     <w:p>
@@ -4102,35 +3227,7 @@
         <w:rPr>
           <w:lang w:val="es-EC"/>
         </w:rPr>
-        <w:t xml:space="preserve">: Uso de </w:t>
-      </w:r>
-      <w:proofErr w:type="spellStart"/>
-      <w:r>
-        <w:rPr>
-          <w:lang w:val="es-EC"/>
-        </w:rPr>
-        <w:t>docker-compose.yml</w:t>
-      </w:r>
-      <w:proofErr w:type="spellEnd"/>
-      <w:r>
-        <w:rPr>
-          <w:lang w:val="es-EC"/>
-        </w:rPr>
-        <w:t xml:space="preserve"> para levantar los servicios de aplicación, base de datos y </w:t>
-      </w:r>
-      <w:proofErr w:type="spellStart"/>
-      <w:r>
-        <w:rPr>
-          <w:lang w:val="es-EC"/>
-        </w:rPr>
-        <w:t>proxies</w:t>
-      </w:r>
-      <w:proofErr w:type="spellEnd"/>
-      <w:r>
-        <w:rPr>
-          <w:lang w:val="es-EC"/>
-        </w:rPr>
-        <w:t xml:space="preserve"> de red de manera coordinada.</w:t>
+        <w:t>: Uso de docker-compose.yml para levantar los servicios de aplicación, base de datos y proxies de red de manera coordinada.</w:t>
       </w:r>
     </w:p>
     <w:p>
@@ -4162,7 +3259,6 @@
         </w:rPr>
         <w:t xml:space="preserve">: Empleo de </w:t>
       </w:r>
-      <w:proofErr w:type="spellStart"/>
       <w:r>
         <w:rPr>
           <w:b/>
@@ -4171,40 +3267,11 @@
         </w:rPr>
         <w:t>Nginx</w:t>
       </w:r>
-      <w:proofErr w:type="spellEnd"/>
-      <w:r>
-        <w:rPr>
-          <w:lang w:val="es-EC"/>
-        </w:rPr>
-        <w:t xml:space="preserve"> para la entrega eficiente de archivos estáticos del </w:t>
-      </w:r>
-      <w:proofErr w:type="spellStart"/>
-      <w:r>
-        <w:rPr>
-          <w:lang w:val="es-EC"/>
-        </w:rPr>
-        <w:t>frontend</w:t>
-      </w:r>
-      <w:proofErr w:type="spellEnd"/>
-      <w:r>
-        <w:rPr>
-          <w:lang w:val="es-EC"/>
-        </w:rPr>
-        <w:t xml:space="preserve"> y la redirección de tráfico hacia la API del </w:t>
-      </w:r>
-      <w:proofErr w:type="spellStart"/>
-      <w:r>
-        <w:rPr>
-          <w:lang w:val="es-EC"/>
-        </w:rPr>
-        <w:t>backend</w:t>
-      </w:r>
-      <w:proofErr w:type="spellEnd"/>
-      <w:r>
-        <w:rPr>
-          <w:lang w:val="es-EC"/>
-        </w:rPr>
-        <w:t>.</w:t>
+      <w:r>
+        <w:rPr>
+          <w:lang w:val="es-EC"/>
+        </w:rPr>
+        <w:t xml:space="preserve"> para la entrega eficiente de archivos estáticos del frontend y la redirección de tráfico hacia la API del backend.</w:t>
       </w:r>
     </w:p>
     <w:p>
@@ -4236,53 +3303,19 @@
         </w:rPr>
         <w:t xml:space="preserve">: Ejecución de </w:t>
       </w:r>
-      <w:proofErr w:type="spellStart"/>
       <w:r>
         <w:rPr>
           <w:i/>
           <w:iCs/>
           <w:lang w:val="es-EC"/>
         </w:rPr>
-        <w:t>health</w:t>
-      </w:r>
-      <w:proofErr w:type="spellEnd"/>
-      <w:r>
-        <w:rPr>
-          <w:i/>
-          <w:iCs/>
-          <w:lang w:val="es-EC"/>
-        </w:rPr>
-        <w:t xml:space="preserve"> </w:t>
-      </w:r>
-      <w:proofErr w:type="spellStart"/>
-      <w:r>
-        <w:rPr>
-          <w:i/>
-          <w:iCs/>
-          <w:lang w:val="es-EC"/>
-        </w:rPr>
-        <w:t>checks</w:t>
-      </w:r>
-      <w:proofErr w:type="spellEnd"/>
-      <w:r>
-        <w:rPr>
-          <w:lang w:val="es-EC"/>
-        </w:rPr>
-        <w:t xml:space="preserve"> sobre los contenedores activos para confirmar la conectividad con la base de datos y la disponibilidad de los </w:t>
-      </w:r>
-      <w:proofErr w:type="spellStart"/>
-      <w:r>
-        <w:rPr>
-          <w:lang w:val="es-EC"/>
-        </w:rPr>
-        <w:t>endpoints</w:t>
-      </w:r>
-      <w:proofErr w:type="spellEnd"/>
-      <w:r>
-        <w:rPr>
-          <w:lang w:val="es-EC"/>
-        </w:rPr>
-        <w:t>.</w:t>
+        <w:t>health checks</w:t>
+      </w:r>
+      <w:r>
+        <w:rPr>
+          <w:lang w:val="es-EC"/>
+        </w:rPr>
+        <w:t xml:space="preserve"> sobre los contenedores activos para confirmar la conectividad con la base de datos y la disponibilidad de los endpoints.</w:t>
       </w:r>
     </w:p>
     <w:p>
@@ -4335,21 +3368,7 @@
         <w:rPr>
           <w:lang w:val="es-EC"/>
         </w:rPr>
-        <w:t xml:space="preserve">Se diseñaron y crearon diagramas de arquitectura y modelos de datos basados rigurosamente en los esquemas de </w:t>
-      </w:r>
-      <w:proofErr w:type="spellStart"/>
-      <w:r>
-        <w:rPr>
-          <w:lang w:val="es-EC"/>
-        </w:rPr>
-        <w:t>Mongoose</w:t>
-      </w:r>
-      <w:proofErr w:type="spellEnd"/>
-      <w:r>
-        <w:rPr>
-          <w:lang w:val="es-EC"/>
-        </w:rPr>
-        <w:t xml:space="preserve"> implementados. Esta acción asegura la coherencia entre la base de datos NoSQL y la lógica de negocio actual.</w:t>
+        <w:t>Se diseñaron y crearon diagramas de arquitectura y modelos de datos basados rigurosamente en los esquemas de Mongoose implementados. Esta acción asegura la coherencia entre la base de datos NoSQL y la lógica de negocio actual.</w:t>
       </w:r>
     </w:p>
     <w:p>
@@ -4393,49 +3412,7 @@
         <w:rPr>
           <w:lang w:val="es-EC"/>
         </w:rPr>
-        <w:t xml:space="preserve">Se establecieron los diagramas de componentes y de despliegue que describen la interacción entre el </w:t>
-      </w:r>
-      <w:proofErr w:type="spellStart"/>
-      <w:r>
-        <w:rPr>
-          <w:lang w:val="es-EC"/>
-        </w:rPr>
-        <w:t>frontend</w:t>
-      </w:r>
-      <w:proofErr w:type="spellEnd"/>
-      <w:r>
-        <w:rPr>
-          <w:lang w:val="es-EC"/>
-        </w:rPr>
-        <w:t xml:space="preserve"> en </w:t>
-      </w:r>
-      <w:proofErr w:type="spellStart"/>
-      <w:r>
-        <w:rPr>
-          <w:lang w:val="es-EC"/>
-        </w:rPr>
-        <w:t>React</w:t>
-      </w:r>
-      <w:proofErr w:type="spellEnd"/>
-      <w:r>
-        <w:rPr>
-          <w:lang w:val="es-EC"/>
-        </w:rPr>
-        <w:t xml:space="preserve"> y los microservicios del </w:t>
-      </w:r>
-      <w:proofErr w:type="spellStart"/>
-      <w:r>
-        <w:rPr>
-          <w:lang w:val="es-EC"/>
-        </w:rPr>
-        <w:t>backend</w:t>
-      </w:r>
-      <w:proofErr w:type="spellEnd"/>
-      <w:r>
-        <w:rPr>
-          <w:lang w:val="es-EC"/>
-        </w:rPr>
-        <w:t>, proporcionando por primera vez una visión holística de la infraestructura.</w:t>
+        <w:t>Se establecieron los diagramas de componentes y de despliegue que describen la interacción entre el frontend en React y los microservicios del backend, proporcionando por primera vez una visión holística de la infraestructura.</w:t>
       </w:r>
     </w:p>
     <w:p>
@@ -4546,14 +3523,12 @@
           <w:lang w:val="es-EC"/>
         </w:rPr>
       </w:pPr>
-      <w:proofErr w:type="spellStart"/>
       <w:r>
         <w:rPr>
           <w:lang w:val="es-EC"/>
         </w:rPr>
         <w:t>React</w:t>
       </w:r>
-      <w:proofErr w:type="spellEnd"/>
     </w:p>
     <w:p>
       <w:pPr>
@@ -4570,20 +3545,11 @@
           <w:lang w:val="es-EC"/>
         </w:rPr>
       </w:pPr>
-      <w:proofErr w:type="spellStart"/>
-      <w:r>
-        <w:rPr>
-          <w:lang w:val="es-EC"/>
-        </w:rPr>
-        <w:lastRenderedPageBreak/>
-        <w:t>Tailwind</w:t>
-      </w:r>
-      <w:proofErr w:type="spellEnd"/>
-      <w:r>
-        <w:rPr>
-          <w:lang w:val="es-EC"/>
-        </w:rPr>
-        <w:t xml:space="preserve"> CSS</w:t>
+      <w:r>
+        <w:rPr>
+          <w:lang w:val="es-EC"/>
+        </w:rPr>
+        <w:t>Tailwind CSS</w:t>
       </w:r>
     </w:p>
     <w:p>
@@ -4601,14 +3567,12 @@
           <w:lang w:val="es-EC"/>
         </w:rPr>
       </w:pPr>
-      <w:proofErr w:type="spellStart"/>
       <w:r>
         <w:rPr>
           <w:lang w:val="es-EC"/>
         </w:rPr>
         <w:t>NPM</w:t>
       </w:r>
-      <w:proofErr w:type="spellEnd"/>
     </w:p>
     <w:p>
       <w:pPr>
@@ -4639,6 +3603,7 @@
         <w:rPr>
           <w:lang w:val="es-EC"/>
         </w:rPr>
+        <w:lastRenderedPageBreak/>
         <w:t>Esta categoría es fundamental para asegurar la integridad de las transacciones y permitir que el esquema de datos evolucione de manera flexible ante nuevos requerimientos funcionales.</w:t>
       </w:r>
     </w:p>
@@ -4679,14 +3644,12 @@
           <w:lang w:val="es-EC"/>
         </w:rPr>
       </w:pPr>
-      <w:proofErr w:type="spellStart"/>
       <w:r>
         <w:rPr>
           <w:lang w:val="es-EC"/>
         </w:rPr>
         <w:t>Mongoose</w:t>
       </w:r>
-      <w:proofErr w:type="spellEnd"/>
     </w:p>
     <w:p>
       <w:pPr>
@@ -4697,23 +3660,13 @@
           <w:lang w:val="es-EC"/>
         </w:rPr>
       </w:pPr>
-      <w:proofErr w:type="spellStart"/>
-      <w:r>
-        <w:rPr>
-          <w:b/>
-          <w:bCs/>
-          <w:lang w:val="es-EC"/>
-        </w:rPr>
-        <w:t>Contenerización</w:t>
-      </w:r>
-      <w:proofErr w:type="spellEnd"/>
-      <w:r>
-        <w:rPr>
-          <w:b/>
-          <w:bCs/>
-          <w:lang w:val="es-EC"/>
-        </w:rPr>
-        <w:t xml:space="preserve"> e Infraestructura</w:t>
+      <w:r>
+        <w:rPr>
+          <w:b/>
+          <w:bCs/>
+          <w:lang w:val="es-EC"/>
+        </w:rPr>
+        <w:t>Contenerización e Infraestructura</w:t>
       </w:r>
     </w:p>
     <w:p>
@@ -4771,16 +3724,8 @@
         <w:rPr>
           <w:lang w:val="es-EC"/>
         </w:rPr>
-        <w:t xml:space="preserve">Docker </w:t>
-      </w:r>
-      <w:proofErr w:type="spellStart"/>
-      <w:r>
-        <w:rPr>
-          <w:lang w:val="es-EC"/>
-        </w:rPr>
-        <w:t>Compose</w:t>
-      </w:r>
-      <w:proofErr w:type="spellEnd"/>
+        <w:t>Docker Compose</w:t>
+      </w:r>
     </w:p>
     <w:p>
       <w:pPr>
@@ -4797,14 +3742,12 @@
           <w:lang w:val="es-EC"/>
         </w:rPr>
       </w:pPr>
-      <w:proofErr w:type="spellStart"/>
       <w:r>
         <w:rPr>
           <w:lang w:val="es-EC"/>
         </w:rPr>
         <w:t>Nginx</w:t>
       </w:r>
-      <w:proofErr w:type="spellEnd"/>
     </w:p>
     <w:p>
       <w:pPr>
@@ -4875,14 +3818,12 @@
           <w:lang w:val="es-EC"/>
         </w:rPr>
       </w:pPr>
-      <w:proofErr w:type="spellStart"/>
       <w:r>
         <w:rPr>
           <w:lang w:val="es-EC"/>
         </w:rPr>
         <w:t>ESLint</w:t>
       </w:r>
-      <w:proofErr w:type="spellEnd"/>
     </w:p>
     <w:p>
       <w:pPr>
@@ -4903,21 +3844,7 @@
         <w:rPr>
           <w:lang w:val="es-EC"/>
         </w:rPr>
-        <w:t>Variables de Entorno (.</w:t>
-      </w:r>
-      <w:proofErr w:type="spellStart"/>
-      <w:r>
-        <w:rPr>
-          <w:lang w:val="es-EC"/>
-        </w:rPr>
-        <w:t>env</w:t>
-      </w:r>
-      <w:proofErr w:type="spellEnd"/>
-      <w:r>
-        <w:rPr>
-          <w:lang w:val="es-EC"/>
-        </w:rPr>
-        <w:t>)</w:t>
+        <w:t>Variables de Entorno (.env)</w:t>
       </w:r>
     </w:p>
     <w:p>
@@ -5054,21 +3981,7 @@
         <w:rPr>
           <w:lang w:val="es-EC"/>
         </w:rPr>
-        <w:t xml:space="preserve">: Compromiso de la clave secreta de </w:t>
-      </w:r>
-      <w:proofErr w:type="spellStart"/>
-      <w:r>
-        <w:rPr>
-          <w:lang w:val="es-EC"/>
-        </w:rPr>
-        <w:t>JWT</w:t>
-      </w:r>
-      <w:proofErr w:type="spellEnd"/>
-      <w:r>
-        <w:rPr>
-          <w:lang w:val="es-EC"/>
-        </w:rPr>
-        <w:t xml:space="preserve"> o gestión inadecuada de la expiración de tokens en auth.js, permitiendo accesos no autorizados.</w:t>
+        <w:t>: Compromiso de la clave secreta de JWT o gestión inadecuada de la expiración de tokens en auth.js, permitiendo accesos no autorizados.</w:t>
       </w:r>
     </w:p>
     <w:p>
@@ -5092,7 +4005,6 @@
           <w:bCs/>
           <w:lang w:val="es-EC"/>
         </w:rPr>
-        <w:lastRenderedPageBreak/>
         <w:t>Pérdida de Conectividad</w:t>
       </w:r>
       <w:r>
@@ -5123,27 +4035,14 @@
           <w:bCs/>
           <w:lang w:val="es-EC"/>
         </w:rPr>
+        <w:lastRenderedPageBreak/>
         <w:t>Degradación del Rendimiento</w:t>
       </w:r>
       <w:r>
         <w:rPr>
           <w:lang w:val="es-EC"/>
         </w:rPr>
-        <w:t xml:space="preserve">: Latencias críticas en consultas de productos debido a la falta de índices optimizados en el esquema de </w:t>
-      </w:r>
-      <w:proofErr w:type="spellStart"/>
-      <w:r>
-        <w:rPr>
-          <w:lang w:val="es-EC"/>
-        </w:rPr>
-        <w:t>Mongoose</w:t>
-      </w:r>
-      <w:proofErr w:type="spellEnd"/>
-      <w:r>
-        <w:rPr>
-          <w:lang w:val="es-EC"/>
-        </w:rPr>
-        <w:t>.</w:t>
+        <w:t>: Latencias críticas en consultas de productos debido a la falta de índices optimizados en el esquema de Mongoose.</w:t>
       </w:r>
     </w:p>
     <w:p>
@@ -5203,49 +4102,7 @@
         <w:rPr>
           <w:lang w:val="es-EC"/>
         </w:rPr>
-        <w:t xml:space="preserve">: Errores en la configuración de </w:t>
-      </w:r>
-      <w:proofErr w:type="spellStart"/>
-      <w:r>
-        <w:rPr>
-          <w:lang w:val="es-EC"/>
-        </w:rPr>
-        <w:t>docker-compose.yml</w:t>
-      </w:r>
-      <w:proofErr w:type="spellEnd"/>
-      <w:r>
-        <w:rPr>
-          <w:lang w:val="es-EC"/>
-        </w:rPr>
-        <w:t xml:space="preserve"> que impidan el levantamiento simultáneo del </w:t>
-      </w:r>
-      <w:proofErr w:type="spellStart"/>
-      <w:r>
-        <w:rPr>
-          <w:lang w:val="es-EC"/>
-        </w:rPr>
-        <w:t>backend</w:t>
-      </w:r>
-      <w:proofErr w:type="spellEnd"/>
-      <w:r>
-        <w:rPr>
-          <w:lang w:val="es-EC"/>
-        </w:rPr>
-        <w:t xml:space="preserve"> y el </w:t>
-      </w:r>
-      <w:proofErr w:type="spellStart"/>
-      <w:r>
-        <w:rPr>
-          <w:lang w:val="es-EC"/>
-        </w:rPr>
-        <w:t>frontend</w:t>
-      </w:r>
-      <w:proofErr w:type="spellEnd"/>
-      <w:r>
-        <w:rPr>
-          <w:lang w:val="es-EC"/>
-        </w:rPr>
-        <w:t>.</w:t>
+        <w:t>: Errores en la configuración de docker-compose.yml que impidan el levantamiento simultáneo del backend y el frontend.</w:t>
       </w:r>
     </w:p>
     <w:p>
@@ -5275,23 +4132,7 @@
         <w:rPr>
           <w:lang w:val="es-EC"/>
         </w:rPr>
-        <w:t xml:space="preserve">: Incompatibilidad surgida por la actualización de dependencias críticas en </w:t>
-      </w:r>
-      <w:proofErr w:type="spellStart"/>
-      <w:proofErr w:type="gramStart"/>
-      <w:r>
-        <w:rPr>
-          <w:lang w:val="es-EC"/>
-        </w:rPr>
-        <w:t>package.json</w:t>
-      </w:r>
-      <w:proofErr w:type="spellEnd"/>
-      <w:proofErr w:type="gramEnd"/>
-      <w:r>
-        <w:rPr>
-          <w:lang w:val="es-EC"/>
-        </w:rPr>
-        <w:t xml:space="preserve"> sin validación previa en el entorno de pruebas.</w:t>
+        <w:t>: Incompatibilidad surgida por la actualización de dependencias críticas en package.json sin validación previa en el entorno de pruebas.</w:t>
       </w:r>
     </w:p>
     <w:p>
@@ -5351,57 +4192,7 @@
         <w:rPr>
           <w:lang w:val="es-EC"/>
         </w:rPr>
-        <w:t>: Filtración accidental de variables de entorno sensibles (</w:t>
-      </w:r>
-      <w:proofErr w:type="spellStart"/>
-      <w:r>
-        <w:rPr>
-          <w:lang w:val="es-EC"/>
-        </w:rPr>
-        <w:t>secrets</w:t>
-      </w:r>
-      <w:proofErr w:type="spellEnd"/>
-      <w:r>
-        <w:rPr>
-          <w:lang w:val="es-EC"/>
-        </w:rPr>
-        <w:t xml:space="preserve">, </w:t>
-      </w:r>
-      <w:proofErr w:type="spellStart"/>
-      <w:r>
-        <w:rPr>
-          <w:lang w:val="es-EC"/>
-        </w:rPr>
-        <w:t>URIs</w:t>
-      </w:r>
-      <w:proofErr w:type="spellEnd"/>
-      <w:r>
-        <w:rPr>
-          <w:lang w:val="es-EC"/>
-        </w:rPr>
-        <w:t xml:space="preserve">) por una gestión inadecuada de los </w:t>
-      </w:r>
-      <w:proofErr w:type="gramStart"/>
-      <w:r>
-        <w:rPr>
-          <w:lang w:val="es-EC"/>
-        </w:rPr>
-        <w:t>archivos .</w:t>
-      </w:r>
-      <w:proofErr w:type="spellStart"/>
-      <w:r>
-        <w:rPr>
-          <w:lang w:val="es-EC"/>
-        </w:rPr>
-        <w:t>env</w:t>
-      </w:r>
-      <w:proofErr w:type="spellEnd"/>
-      <w:proofErr w:type="gramEnd"/>
-      <w:r>
-        <w:rPr>
-          <w:lang w:val="es-EC"/>
-        </w:rPr>
-        <w:t>.</w:t>
+        <w:t>: Filtración accidental de variables de entorno sensibles (secrets, URIs) por una gestión inadecuada de los archivos .env.</w:t>
       </w:r>
     </w:p>
     <w:p>
@@ -5480,37 +4271,13 @@
           <w:iCs/>
           <w:lang w:val="es-EC"/>
         </w:rPr>
-        <w:t xml:space="preserve">cron </w:t>
-      </w:r>
-      <w:proofErr w:type="spellStart"/>
-      <w:r>
-        <w:rPr>
-          <w:i/>
-          <w:iCs/>
-          <w:lang w:val="es-EC"/>
-        </w:rPr>
-        <w:t>jobs</w:t>
-      </w:r>
-      <w:proofErr w:type="spellEnd"/>
-      <w:r>
-        <w:rPr>
-          <w:lang w:val="es-EC"/>
-        </w:rPr>
-        <w:t xml:space="preserve"> para respaldos diarios con </w:t>
-      </w:r>
-      <w:proofErr w:type="spellStart"/>
-      <w:r>
-        <w:rPr>
-          <w:lang w:val="es-EC"/>
-        </w:rPr>
-        <w:t>mongodump</w:t>
-      </w:r>
-      <w:proofErr w:type="spellEnd"/>
-      <w:r>
-        <w:rPr>
-          <w:lang w:val="es-EC"/>
-        </w:rPr>
-        <w:t xml:space="preserve"> y empleo de volúmenes persistentes en Docker para asegurar la persistencia ante reinicios.</w:t>
+        <w:t>cron jobs</w:t>
+      </w:r>
+      <w:r>
+        <w:rPr>
+          <w:lang w:val="es-EC"/>
+        </w:rPr>
+        <w:t xml:space="preserve"> para respaldos diarios con mongodump y empleo de volúmenes persistentes en Docker para asegurar la persistencia ante reinicios.</w:t>
       </w:r>
     </w:p>
     <w:p>
@@ -5527,35 +4294,7 @@
         <w:rPr>
           <w:lang w:val="es-EC"/>
         </w:rPr>
-        <w:t xml:space="preserve">Rotación periódica de </w:t>
-      </w:r>
-      <w:proofErr w:type="spellStart"/>
-      <w:r>
-        <w:rPr>
-          <w:lang w:val="es-EC"/>
-        </w:rPr>
-        <w:t>jwtSecret</w:t>
-      </w:r>
-      <w:proofErr w:type="spellEnd"/>
-      <w:r>
-        <w:rPr>
-          <w:lang w:val="es-EC"/>
-        </w:rPr>
-        <w:t xml:space="preserve">, implementación de certificados SSL/TLS en </w:t>
-      </w:r>
-      <w:proofErr w:type="spellStart"/>
-      <w:r>
-        <w:rPr>
-          <w:lang w:val="es-EC"/>
-        </w:rPr>
-        <w:t>Nginx</w:t>
-      </w:r>
-      <w:proofErr w:type="spellEnd"/>
-      <w:r>
-        <w:rPr>
-          <w:lang w:val="es-EC"/>
-        </w:rPr>
-        <w:t xml:space="preserve"> y validación estricta de esquemas en la capa de middleware.</w:t>
+        <w:t>Rotación periódica de jwtSecret, implementación de certificados SSL/TLS en Nginx y validación estricta de esquemas en la capa de middleware.</w:t>
       </w:r>
     </w:p>
     <w:p>
@@ -5574,7 +4313,6 @@
         </w:rPr>
         <w:t xml:space="preserve">Integración de sistemas de </w:t>
       </w:r>
-      <w:proofErr w:type="spellStart"/>
       <w:r>
         <w:rPr>
           <w:i/>
@@ -5583,7 +4321,6 @@
         </w:rPr>
         <w:t>logging</w:t>
       </w:r>
-      <w:proofErr w:type="spellEnd"/>
       <w:r>
         <w:rPr>
           <w:lang w:val="es-EC"/>
@@ -5597,14 +4334,14 @@
         <w:rPr>
           <w:b/>
           <w:bCs/>
-          <w:lang w:val="pt-PT"/>
-        </w:rPr>
-      </w:pPr>
-      <w:r>
-        <w:rPr>
-          <w:b/>
-          <w:bCs/>
-          <w:lang w:val="pt-PT"/>
+          <w:lang w:val="es-EC"/>
+        </w:rPr>
+      </w:pPr>
+      <w:r>
+        <w:rPr>
+          <w:b/>
+          <w:bCs/>
+          <w:lang w:val="es-EC"/>
         </w:rPr>
         <w:t>8. ANEXOS</w:t>
       </w:r>
@@ -5613,51 +4350,38 @@
       <w:pPr>
         <w:ind w:left="708"/>
         <w:rPr>
-          <w:lang w:val="pt-PT"/>
-        </w:rPr>
-      </w:pPr>
-      <w:r>
-        <w:rPr>
-          <w:b/>
-          <w:bCs/>
-          <w:lang w:val="pt-PT"/>
+          <w:lang w:val="es-EC"/>
+        </w:rPr>
+      </w:pPr>
+      <w:r>
+        <w:rPr>
+          <w:b/>
+          <w:bCs/>
+          <w:lang w:val="es-EC"/>
         </w:rPr>
         <w:t>REPOSITORIO:</w:t>
       </w:r>
       <w:r>
         <w:rPr>
-          <w:lang w:val="pt-PT"/>
+          <w:lang w:val="es-EC"/>
         </w:rPr>
         <w:t xml:space="preserve"> </w:t>
       </w:r>
-      <w:r>
-        <w:fldChar w:fldCharType="begin"/>
-      </w:r>
-      <w:r>
-        <w:rPr>
-          <w:lang w:val="pt-PT"/>
-        </w:rPr>
-        <w:instrText>HYPERLINK "https://github.com/JohannCaizaguano/Recuperacion"</w:instrText>
-      </w:r>
-      <w:r>
-        <w:fldChar w:fldCharType="separate"/>
-      </w:r>
-      <w:r>
-        <w:rPr>
-          <w:rStyle w:val="Hipervnculo"/>
-          <w:lang w:val="pt-PT"/>
-        </w:rPr>
-        <w:t>https://github.com/JohannCaizaguano/Recuperacion</w:t>
-      </w:r>
-      <w:r>
-        <w:fldChar w:fldCharType="end"/>
-      </w:r>
+      <w:hyperlink r:id="rId8" w:history="1">
+        <w:r>
+          <w:rPr>
+            <w:rStyle w:val="Hipervnculo"/>
+            <w:lang w:val="es-EC"/>
+          </w:rPr>
+          <w:t>https://github.com/JohannCaizaguano/Recuperacion</w:t>
+        </w:r>
+      </w:hyperlink>
     </w:p>
     <w:p>
       <w:pPr>
         <w:ind w:left="708"/>
         <w:rPr>
-          <w:lang w:val="pt-PT"/>
+          <w:lang w:val="es-EC"/>
         </w:rPr>
       </w:pPr>
     </w:p>
@@ -5665,7 +4389,7 @@
       <w:pPr>
         <w:ind w:left="708"/>
         <w:rPr>
-          <w:lang w:val="pt-PT"/>
+          <w:lang w:val="es-EC"/>
         </w:rPr>
       </w:pPr>
     </w:p>
@@ -5673,7 +4397,7 @@
       <w:pPr>
         <w:ind w:left="708"/>
         <w:rPr>
-          <w:lang w:val="pt-PT"/>
+          <w:lang w:val="es-EC"/>
         </w:rPr>
       </w:pPr>
     </w:p>
@@ -5681,7 +4405,7 @@
       <w:pPr>
         <w:ind w:left="708"/>
         <w:rPr>
-          <w:lang w:val="pt-PT"/>
+          <w:lang w:val="es-EC"/>
         </w:rPr>
       </w:pPr>
     </w:p>
@@ -5689,7 +4413,7 @@
       <w:pPr>
         <w:ind w:left="708"/>
         <w:rPr>
-          <w:lang w:val="pt-PT"/>
+          <w:lang w:val="es-EC"/>
         </w:rPr>
       </w:pPr>
     </w:p>
@@ -5697,7 +4421,7 @@
       <w:pPr>
         <w:ind w:left="708"/>
         <w:rPr>
-          <w:lang w:val="pt-PT"/>
+          <w:lang w:val="es-EC"/>
         </w:rPr>
       </w:pPr>
     </w:p>
@@ -5705,24 +4429,23 @@
       <w:pPr>
         <w:ind w:left="708"/>
         <w:rPr>
-          <w:lang w:val="pt-PT"/>
-        </w:rPr>
-      </w:pPr>
-    </w:p>
-    <w:p>
-      <w:pPr>
-        <w:rPr>
-          <w:b/>
-          <w:bCs/>
-          <w:lang w:val="es-EC"/>
-        </w:rPr>
-      </w:pPr>
-      <w:r>
-        <w:rPr>
-          <w:b/>
-          <w:bCs/>
-        </w:rPr>
-        <w:lastRenderedPageBreak/>
+          <w:lang w:val="es-EC"/>
+        </w:rPr>
+      </w:pPr>
+    </w:p>
+    <w:p>
+      <w:pPr>
+        <w:rPr>
+          <w:b/>
+          <w:bCs/>
+          <w:lang w:val="es-EC"/>
+        </w:rPr>
+      </w:pPr>
+      <w:r>
+        <w:rPr>
+          <w:b/>
+          <w:bCs/>
+        </w:rPr>
         <w:t xml:space="preserve">9. </w:t>
       </w:r>
       <w:r>
@@ -5770,6 +4493,7 @@
         <w:rPr>
           <w:lang w:val="es-EC"/>
         </w:rPr>
+        <w:lastRenderedPageBreak/>
         <w:t>La ejecución del mantenimiento correctivo en los controladores de transacciones y pedidos permitió subsanar fallas de lógica que comprometían la integridad del inventario, asegurando una sincronización atómica entre las operaciones del cliente y la persistencia en la base de datos NoSQL.</w:t>
       </w:r>
     </w:p>
@@ -5792,21 +4516,7 @@
         <w:rPr>
           <w:lang w:val="es-EC"/>
         </w:rPr>
-        <w:t>La reestructuración del middleware de autenticación y la implementación de validaciones estrictas para los JSON Web Tokens (</w:t>
-      </w:r>
-      <w:proofErr w:type="spellStart"/>
-      <w:r>
-        <w:rPr>
-          <w:lang w:val="es-EC"/>
-        </w:rPr>
-        <w:t>JWT</w:t>
-      </w:r>
-      <w:proofErr w:type="spellEnd"/>
-      <w:r>
-        <w:rPr>
-          <w:lang w:val="es-EC"/>
-        </w:rPr>
-        <w:t>) mitigaron riesgos críticos de acceso no autorizado, garantizando que el flujo de información sensible se mantenga protegido bajo estándares industriales (RFC 7519).</w:t>
+        <w:t>La reestructuración del middleware de autenticación y la implementación de validaciones estrictas para los JSON Web Tokens (JWT) mitigaron riesgos críticos de acceso no autorizado, garantizando que el flujo de información sensible se mantenga protegido bajo estándares industriales (RFC 7519).</w:t>
       </w:r>
     </w:p>
     <w:p>
@@ -5828,21 +4538,7 @@
         <w:rPr>
           <w:lang w:val="es-EC"/>
         </w:rPr>
-        <w:t>La aplicación de técnicas de refactorización y la integración de herramientas de análisis estático (</w:t>
-      </w:r>
-      <w:proofErr w:type="spellStart"/>
-      <w:r>
-        <w:rPr>
-          <w:lang w:val="es-EC"/>
-        </w:rPr>
-        <w:t>ESLint</w:t>
-      </w:r>
-      <w:proofErr w:type="spellEnd"/>
-      <w:r>
-        <w:rPr>
-          <w:lang w:val="es-EC"/>
-        </w:rPr>
-        <w:t>) y pruebas automatizadas (Jest) elevaron la cohesión de los módulos principales, reduciendo el acoplamiento y facilitando la escalabilidad futura del software.</w:t>
+        <w:t>La aplicación de técnicas de refactorización y la integración de herramientas de análisis estático (ESLint) y pruebas automatizadas (Jest) elevaron la cohesión de los módulos principales, reduciendo el acoplamiento y facilitando la escalabilidad futura del software.</w:t>
       </w:r>
     </w:p>
     <w:p>
@@ -5910,21 +4606,7 @@
         <w:rPr>
           <w:lang w:val="es-EC"/>
         </w:rPr>
-        <w:t xml:space="preserve">Se recomienda integrar soluciones de monitoreo en tiempo real para supervisar el rendimiento de los </w:t>
-      </w:r>
-      <w:proofErr w:type="spellStart"/>
-      <w:r>
-        <w:rPr>
-          <w:lang w:val="es-EC"/>
-        </w:rPr>
-        <w:t>endpoints</w:t>
-      </w:r>
-      <w:proofErr w:type="spellEnd"/>
-      <w:r>
-        <w:rPr>
-          <w:lang w:val="es-EC"/>
-        </w:rPr>
-        <w:t xml:space="preserve"> y el estado de la base de datos, permitiendo una respuesta proactiva ante posibles degradaciones de servicio o picos anómalos de tráfico.</w:t>
+        <w:t>Se recomienda integrar soluciones de monitoreo en tiempo real para supervisar el rendimiento de los endpoints y el estado de la base de datos, permitiendo una respuesta proactiva ante posibles degradaciones de servicio o picos anómalos de tráfico.</w:t>
       </w:r>
     </w:p>
     <w:p>
@@ -11830,7 +10512,7 @@
     <w:basedOn w:val="Fuentedeprrafopredeter"/>
     <w:rsid w:val="00C26C7C"/>
   </w:style>
-  <w:style w:type="character" w:styleId="Textoennegrita">
+  <w:style w:type="character" w:styleId="Fuerte">
     <w:name w:val="Strong"/>
     <w:basedOn w:val="Fuentedeprrafopredeter"/>
     <w:uiPriority w:val="22"/>

</xml_diff>

<commit_message>
feat: informe de mantenimiento y fixes varios para el testing
</commit_message>
<xml_diff>
--- a/docs/Informe de Practica Ejecución de Mantenimiento.docx
+++ b/docs/Informe de Practica Ejecución de Mantenimiento.docx
@@ -1569,6 +1569,55 @@
     </w:p>
     <w:p>
       <w:pPr>
+        <w:ind w:left="1776"/>
+        <w:jc w:val="center"/>
+      </w:pPr>
+      <w:r>
+        <w:drawing>
+          <wp:inline distT="0" distB="0" distL="0" distR="0" wp14:anchorId="2717653E" wp14:editId="2A6C984B">
+            <wp:extent cx="1390739" cy="3370012"/>
+            <wp:effectExtent l="0" t="0" r="0" b="1905"/>
+            <wp:docPr id="1924598295" name="Imagen 1"/>
+            <wp:cNvGraphicFramePr>
+              <a:graphicFrameLocks xmlns:a="http://schemas.openxmlformats.org/drawingml/2006/main" noChangeAspect="1"/>
+            </wp:cNvGraphicFramePr>
+            <a:graphic xmlns:a="http://schemas.openxmlformats.org/drawingml/2006/main">
+              <a:graphicData uri="http://schemas.openxmlformats.org/drawingml/2006/picture">
+                <pic:pic xmlns:pic="http://schemas.openxmlformats.org/drawingml/2006/picture">
+                  <pic:nvPicPr>
+                    <pic:cNvPr id="1924598295" name="Imagen 1"/>
+                    <pic:cNvPicPr/>
+                  </pic:nvPicPr>
+                  <pic:blipFill>
+                    <a:blip r:embed="rId8" cstate="print">
+                      <a:extLst>
+                        <a:ext uri="{28A0092B-C50C-407E-A947-70E740481C1C}">
+                          <a14:useLocalDpi xmlns:a14="http://schemas.microsoft.com/office/drawing/2010/main" val="0"/>
+                        </a:ext>
+                      </a:extLst>
+                    </a:blip>
+                    <a:stretch>
+                      <a:fillRect/>
+                    </a:stretch>
+                  </pic:blipFill>
+                  <pic:spPr>
+                    <a:xfrm>
+                      <a:off x="0" y="0"/>
+                      <a:ext cx="1390739" cy="3370012"/>
+                    </a:xfrm>
+                    <a:prstGeom prst="rect">
+                      <a:avLst/>
+                    </a:prstGeom>
+                  </pic:spPr>
+                </pic:pic>
+              </a:graphicData>
+            </a:graphic>
+          </wp:inline>
+        </w:drawing>
+      </w:r>
+    </w:p>
+    <w:p>
+      <w:pPr>
         <w:numPr>
           <w:ilvl w:val="0"/>
           <w:numId w:val="9"/>
@@ -1580,7 +1629,51 @@
         <w:ind w:left="1776"/>
       </w:pPr>
       <w:r>
+        <w:lastRenderedPageBreak/>
         <w:t>Componentes principales</w:t>
+      </w:r>
+    </w:p>
+    <w:p>
+      <w:pPr>
+        <w:ind w:left="1776"/>
+        <w:jc w:val="center"/>
+      </w:pPr>
+      <w:r>
+        <w:drawing>
+          <wp:inline distT="0" distB="0" distL="0" distR="0" wp14:anchorId="71AA0D82" wp14:editId="6FD8737A">
+            <wp:extent cx="3423530" cy="4202125"/>
+            <wp:effectExtent l="0" t="0" r="5715" b="8255"/>
+            <wp:docPr id="1376868544" name="Imagen 1"/>
+            <wp:cNvGraphicFramePr>
+              <a:graphicFrameLocks xmlns:a="http://schemas.openxmlformats.org/drawingml/2006/main" noChangeAspect="1"/>
+            </wp:cNvGraphicFramePr>
+            <a:graphic xmlns:a="http://schemas.openxmlformats.org/drawingml/2006/main">
+              <a:graphicData uri="http://schemas.openxmlformats.org/drawingml/2006/picture">
+                <pic:pic xmlns:pic="http://schemas.openxmlformats.org/drawingml/2006/picture">
+                  <pic:nvPicPr>
+                    <pic:cNvPr id="1376868544" name=""/>
+                    <pic:cNvPicPr/>
+                  </pic:nvPicPr>
+                  <pic:blipFill>
+                    <a:blip r:embed="rId9"/>
+                    <a:stretch>
+                      <a:fillRect/>
+                    </a:stretch>
+                  </pic:blipFill>
+                  <pic:spPr>
+                    <a:xfrm>
+                      <a:off x="0" y="0"/>
+                      <a:ext cx="3429955" cy="4210011"/>
+                    </a:xfrm>
+                    <a:prstGeom prst="rect">
+                      <a:avLst/>
+                    </a:prstGeom>
+                  </pic:spPr>
+                </pic:pic>
+              </a:graphicData>
+            </a:graphic>
+          </wp:inline>
+        </w:drawing>
       </w:r>
     </w:p>
     <w:p>
@@ -1601,6 +1694,174 @@
     </w:p>
     <w:p>
       <w:pPr>
+        <w:ind w:left="1416"/>
+        <w:jc w:val="center"/>
+      </w:pPr>
+      <w:r>
+        <w:rPr>
+          <w:noProof/>
+        </w:rPr>
+        <w:drawing>
+          <wp:inline distT="0" distB="0" distL="0" distR="0" wp14:anchorId="30E547C0" wp14:editId="081519AC">
+            <wp:extent cx="4694938" cy="3623344"/>
+            <wp:effectExtent l="0" t="0" r="0" b="0"/>
+            <wp:docPr id="2035909177" name="Imagen 1" descr="PlantUML diagram"/>
+            <wp:cNvGraphicFramePr>
+              <a:graphicFrameLocks xmlns:a="http://schemas.openxmlformats.org/drawingml/2006/main" noChangeAspect="1"/>
+            </wp:cNvGraphicFramePr>
+            <a:graphic xmlns:a="http://schemas.openxmlformats.org/drawingml/2006/main">
+              <a:graphicData uri="http://schemas.openxmlformats.org/drawingml/2006/picture">
+                <pic:pic xmlns:pic="http://schemas.openxmlformats.org/drawingml/2006/picture">
+                  <pic:nvPicPr>
+                    <pic:cNvPr id="0" name="theimg" descr="PlantUML diagram"/>
+                    <pic:cNvPicPr>
+                      <a:picLocks noChangeAspect="1" noChangeArrowheads="1"/>
+                    </pic:cNvPicPr>
+                  </pic:nvPicPr>
+                  <pic:blipFill>
+                    <a:blip r:embed="rId10" cstate="print">
+                      <a:extLst>
+                        <a:ext uri="{28A0092B-C50C-407E-A947-70E740481C1C}">
+                          <a14:useLocalDpi xmlns:a14="http://schemas.microsoft.com/office/drawing/2010/main" val="0"/>
+                        </a:ext>
+                      </a:extLst>
+                    </a:blip>
+                    <a:srcRect/>
+                    <a:stretch>
+                      <a:fillRect/>
+                    </a:stretch>
+                  </pic:blipFill>
+                  <pic:spPr bwMode="auto">
+                    <a:xfrm>
+                      <a:off x="0" y="0"/>
+                      <a:ext cx="4698866" cy="3626376"/>
+                    </a:xfrm>
+                    <a:prstGeom prst="rect">
+                      <a:avLst/>
+                    </a:prstGeom>
+                    <a:noFill/>
+                    <a:ln>
+                      <a:noFill/>
+                    </a:ln>
+                  </pic:spPr>
+                </pic:pic>
+              </a:graphicData>
+            </a:graphic>
+          </wp:inline>
+        </w:drawing>
+      </w:r>
+    </w:p>
+    <w:p>
+      <w:pPr>
+        <w:ind w:left="1416"/>
+        <w:jc w:val="center"/>
+      </w:pPr>
+      <w:r>
+        <w:rPr>
+          <w:noProof/>
+        </w:rPr>
+        <w:lastRenderedPageBreak/>
+        <w:drawing>
+          <wp:inline distT="0" distB="0" distL="0" distR="0" wp14:anchorId="047B0E4A" wp14:editId="160E1099">
+            <wp:extent cx="3363362" cy="3622249"/>
+            <wp:effectExtent l="0" t="0" r="8890" b="0"/>
+            <wp:docPr id="1821987634" name="Imagen 2" descr="PlantUML diagram"/>
+            <wp:cNvGraphicFramePr>
+              <a:graphicFrameLocks xmlns:a="http://schemas.openxmlformats.org/drawingml/2006/main" noChangeAspect="1"/>
+            </wp:cNvGraphicFramePr>
+            <a:graphic xmlns:a="http://schemas.openxmlformats.org/drawingml/2006/main">
+              <a:graphicData uri="http://schemas.openxmlformats.org/drawingml/2006/picture">
+                <pic:pic xmlns:pic="http://schemas.openxmlformats.org/drawingml/2006/picture">
+                  <pic:nvPicPr>
+                    <pic:cNvPr id="0" name="theimg" descr="PlantUML diagram"/>
+                    <pic:cNvPicPr>
+                      <a:picLocks noChangeAspect="1" noChangeArrowheads="1"/>
+                    </pic:cNvPicPr>
+                  </pic:nvPicPr>
+                  <pic:blipFill>
+                    <a:blip r:embed="rId11">
+                      <a:extLst>
+                        <a:ext uri="{28A0092B-C50C-407E-A947-70E740481C1C}">
+                          <a14:useLocalDpi xmlns:a14="http://schemas.microsoft.com/office/drawing/2010/main" val="0"/>
+                        </a:ext>
+                      </a:extLst>
+                    </a:blip>
+                    <a:srcRect/>
+                    <a:stretch>
+                      <a:fillRect/>
+                    </a:stretch>
+                  </pic:blipFill>
+                  <pic:spPr bwMode="auto">
+                    <a:xfrm>
+                      <a:off x="0" y="0"/>
+                      <a:ext cx="3370514" cy="3629951"/>
+                    </a:xfrm>
+                    <a:prstGeom prst="rect">
+                      <a:avLst/>
+                    </a:prstGeom>
+                    <a:noFill/>
+                    <a:ln>
+                      <a:noFill/>
+                    </a:ln>
+                  </pic:spPr>
+                </pic:pic>
+              </a:graphicData>
+            </a:graphic>
+          </wp:inline>
+        </w:drawing>
+      </w:r>
+    </w:p>
+    <w:p>
+      <w:pPr>
+        <w:ind w:left="1416"/>
+        <w:jc w:val="center"/>
+      </w:pPr>
+    </w:p>
+    <w:p>
+      <w:pPr>
+        <w:ind w:left="1416"/>
+        <w:jc w:val="center"/>
+      </w:pPr>
+      <w:r>
+        <w:drawing>
+          <wp:inline distT="0" distB="0" distL="0" distR="0" wp14:anchorId="16A788F5" wp14:editId="1DF3A8AA">
+            <wp:extent cx="3676505" cy="3061704"/>
+            <wp:effectExtent l="0" t="0" r="635" b="5715"/>
+            <wp:docPr id="1713977179" name="Imagen 1"/>
+            <wp:cNvGraphicFramePr>
+              <a:graphicFrameLocks xmlns:a="http://schemas.openxmlformats.org/drawingml/2006/main" noChangeAspect="1"/>
+            </wp:cNvGraphicFramePr>
+            <a:graphic xmlns:a="http://schemas.openxmlformats.org/drawingml/2006/main">
+              <a:graphicData uri="http://schemas.openxmlformats.org/drawingml/2006/picture">
+                <pic:pic xmlns:pic="http://schemas.openxmlformats.org/drawingml/2006/picture">
+                  <pic:nvPicPr>
+                    <pic:cNvPr id="1713977179" name=""/>
+                    <pic:cNvPicPr/>
+                  </pic:nvPicPr>
+                  <pic:blipFill>
+                    <a:blip r:embed="rId12"/>
+                    <a:stretch>
+                      <a:fillRect/>
+                    </a:stretch>
+                  </pic:blipFill>
+                  <pic:spPr>
+                    <a:xfrm>
+                      <a:off x="0" y="0"/>
+                      <a:ext cx="3684795" cy="3068608"/>
+                    </a:xfrm>
+                    <a:prstGeom prst="rect">
+                      <a:avLst/>
+                    </a:prstGeom>
+                  </pic:spPr>
+                </pic:pic>
+              </a:graphicData>
+            </a:graphic>
+          </wp:inline>
+        </w:drawing>
+      </w:r>
+    </w:p>
+    <w:p>
+      <w:pPr>
         <w:ind w:left="708"/>
         <w:outlineLvl w:val="2"/>
         <w:rPr>
@@ -1733,6 +1994,7 @@
           <w:bCs/>
           <w:lang w:val="es-EC"/>
         </w:rPr>
+        <w:lastRenderedPageBreak/>
         <w:t>Marco de Trabajo</w:t>
       </w:r>
       <w:r>
@@ -1800,7 +2062,6 @@
           <w:b/>
           <w:bCs/>
         </w:rPr>
-        <w:lastRenderedPageBreak/>
         <w:t>3. Tipos de Mantenimiento</w:t>
       </w:r>
     </w:p>
@@ -2018,8 +2279,36 @@
         <w:rPr>
           <w:lang w:val="es-EC"/>
         </w:rPr>
-        <w:t>Optimización de las funciones de agregación en los controladores de backend para reducir el consumo de recursos de CPU durante la generación de métricas del Dashboard.</w:t>
-      </w:r>
+        <w:t xml:space="preserve">Optimización de las funciones de agregación en los controladores de backend para reducir el consumo de recursos de CPU durante la generación de métricas del </w:t>
+      </w:r>
+      <w:proofErr w:type="spellStart"/>
+      <w:r>
+        <w:rPr>
+          <w:lang w:val="es-EC"/>
+        </w:rPr>
+        <w:t>Dashboard</w:t>
+      </w:r>
+      <w:proofErr w:type="spellEnd"/>
+      <w:r>
+        <w:rPr>
+          <w:lang w:val="es-EC"/>
+        </w:rPr>
+        <w:t>.</w:t>
+      </w:r>
+    </w:p>
+    <w:p>
+      <w:pPr>
+        <w:rPr>
+          <w:lang w:val="es-EC"/>
+        </w:rPr>
+      </w:pPr>
+    </w:p>
+    <w:p>
+      <w:pPr>
+        <w:rPr>
+          <w:lang w:val="es-EC"/>
+        </w:rPr>
+      </w:pPr>
     </w:p>
     <w:p>
       <w:pPr>
@@ -2042,6 +2331,7 @@
           <w:b/>
           <w:bCs/>
         </w:rPr>
+        <w:lastRenderedPageBreak/>
         <w:t>3.4 Mantenimiento preventivo</w:t>
       </w:r>
     </w:p>
@@ -2086,7 +2376,6 @@
         <w:rPr>
           <w:lang w:val="es-EC"/>
         </w:rPr>
-        <w:lastRenderedPageBreak/>
         <w:t>Fortalecimiento de las capas de middleware y servicios para que la lógica de negocio sea independiente de la implementación técnica de la API, previniendo errores en cascada ante cambios futuros.</w:t>
       </w:r>
     </w:p>
@@ -2617,6 +2906,7 @@
                 <w:b/>
                 <w:bCs/>
               </w:rPr>
+              <w:lastRenderedPageBreak/>
               <w:t>Conectividad (dbConnection.js)</w:t>
             </w:r>
           </w:p>
@@ -2698,7 +2988,6 @@
                 <w:b/>
                 <w:bCs/>
               </w:rPr>
-              <w:lastRenderedPageBreak/>
               <w:t>Optimización (ProductModel.js)</w:t>
             </w:r>
           </w:p>
@@ -3089,6 +3378,55 @@
     </w:p>
     <w:p>
       <w:pPr>
+        <w:ind w:left="2148"/>
+        <w:rPr>
+          <w:lang w:val="es-EC"/>
+        </w:rPr>
+      </w:pPr>
+      <w:r>
+        <w:rPr>
+          <w:lang w:val="es-EC"/>
+        </w:rPr>
+        <w:lastRenderedPageBreak/>
+        <w:drawing>
+          <wp:inline distT="0" distB="0" distL="0" distR="0" wp14:anchorId="47C76FA9" wp14:editId="399D34DF">
+            <wp:extent cx="3690004" cy="2104967"/>
+            <wp:effectExtent l="0" t="0" r="5715" b="0"/>
+            <wp:docPr id="1003928568" name="Imagen 1"/>
+            <wp:cNvGraphicFramePr>
+              <a:graphicFrameLocks xmlns:a="http://schemas.openxmlformats.org/drawingml/2006/main" noChangeAspect="1"/>
+            </wp:cNvGraphicFramePr>
+            <a:graphic xmlns:a="http://schemas.openxmlformats.org/drawingml/2006/main">
+              <a:graphicData uri="http://schemas.openxmlformats.org/drawingml/2006/picture">
+                <pic:pic xmlns:pic="http://schemas.openxmlformats.org/drawingml/2006/picture">
+                  <pic:nvPicPr>
+                    <pic:cNvPr id="1003928568" name=""/>
+                    <pic:cNvPicPr/>
+                  </pic:nvPicPr>
+                  <pic:blipFill>
+                    <a:blip r:embed="rId13"/>
+                    <a:stretch>
+                      <a:fillRect/>
+                    </a:stretch>
+                  </pic:blipFill>
+                  <pic:spPr>
+                    <a:xfrm>
+                      <a:off x="0" y="0"/>
+                      <a:ext cx="3695352" cy="2108018"/>
+                    </a:xfrm>
+                    <a:prstGeom prst="rect">
+                      <a:avLst/>
+                    </a:prstGeom>
+                  </pic:spPr>
+                </pic:pic>
+              </a:graphicData>
+            </a:graphic>
+          </wp:inline>
+        </w:drawing>
+      </w:r>
+    </w:p>
+    <w:p>
+      <w:pPr>
         <w:numPr>
           <w:ilvl w:val="1"/>
           <w:numId w:val="27"/>
@@ -3111,6 +3449,54 @@
     </w:p>
     <w:p>
       <w:pPr>
+        <w:ind w:left="2148"/>
+        <w:rPr>
+          <w:lang w:val="es-EC"/>
+        </w:rPr>
+      </w:pPr>
+      <w:r>
+        <w:rPr>
+          <w:lang w:val="es-EC"/>
+        </w:rPr>
+        <w:drawing>
+          <wp:inline distT="0" distB="0" distL="0" distR="0" wp14:anchorId="5DDE6613" wp14:editId="1EF13218">
+            <wp:extent cx="3948027" cy="2237806"/>
+            <wp:effectExtent l="0" t="0" r="0" b="0"/>
+            <wp:docPr id="330404749" name="Imagen 1"/>
+            <wp:cNvGraphicFramePr>
+              <a:graphicFrameLocks xmlns:a="http://schemas.openxmlformats.org/drawingml/2006/main" noChangeAspect="1"/>
+            </wp:cNvGraphicFramePr>
+            <a:graphic xmlns:a="http://schemas.openxmlformats.org/drawingml/2006/main">
+              <a:graphicData uri="http://schemas.openxmlformats.org/drawingml/2006/picture">
+                <pic:pic xmlns:pic="http://schemas.openxmlformats.org/drawingml/2006/picture">
+                  <pic:nvPicPr>
+                    <pic:cNvPr id="330404749" name=""/>
+                    <pic:cNvPicPr/>
+                  </pic:nvPicPr>
+                  <pic:blipFill>
+                    <a:blip r:embed="rId14"/>
+                    <a:stretch>
+                      <a:fillRect/>
+                    </a:stretch>
+                  </pic:blipFill>
+                  <pic:spPr>
+                    <a:xfrm>
+                      <a:off x="0" y="0"/>
+                      <a:ext cx="3957974" cy="2243444"/>
+                    </a:xfrm>
+                    <a:prstGeom prst="rect">
+                      <a:avLst/>
+                    </a:prstGeom>
+                  </pic:spPr>
+                </pic:pic>
+              </a:graphicData>
+            </a:graphic>
+          </wp:inline>
+        </w:drawing>
+      </w:r>
+    </w:p>
+    <w:p>
+      <w:pPr>
         <w:numPr>
           <w:ilvl w:val="1"/>
           <w:numId w:val="27"/>
@@ -3133,10 +3519,51 @@
     </w:p>
     <w:p>
       <w:pPr>
-        <w:rPr>
-          <w:lang w:val="es-EC"/>
-        </w:rPr>
-      </w:pPr>
+        <w:ind w:left="2148"/>
+        <w:rPr>
+          <w:lang w:val="es-EC"/>
+        </w:rPr>
+      </w:pPr>
+      <w:r>
+        <w:rPr>
+          <w:lang w:val="es-EC"/>
+        </w:rPr>
+        <w:drawing>
+          <wp:inline distT="0" distB="0" distL="0" distR="0" wp14:anchorId="478884C2" wp14:editId="4319340E">
+            <wp:extent cx="3779822" cy="1268023"/>
+            <wp:effectExtent l="0" t="0" r="0" b="8890"/>
+            <wp:docPr id="2012498213" name="Imagen 1"/>
+            <wp:cNvGraphicFramePr>
+              <a:graphicFrameLocks xmlns:a="http://schemas.openxmlformats.org/drawingml/2006/main" noChangeAspect="1"/>
+            </wp:cNvGraphicFramePr>
+            <a:graphic xmlns:a="http://schemas.openxmlformats.org/drawingml/2006/main">
+              <a:graphicData uri="http://schemas.openxmlformats.org/drawingml/2006/picture">
+                <pic:pic xmlns:pic="http://schemas.openxmlformats.org/drawingml/2006/picture">
+                  <pic:nvPicPr>
+                    <pic:cNvPr id="2012498213" name=""/>
+                    <pic:cNvPicPr/>
+                  </pic:nvPicPr>
+                  <pic:blipFill>
+                    <a:blip r:embed="rId15"/>
+                    <a:stretch>
+                      <a:fillRect/>
+                    </a:stretch>
+                  </pic:blipFill>
+                  <pic:spPr>
+                    <a:xfrm>
+                      <a:off x="0" y="0"/>
+                      <a:ext cx="3800131" cy="1274836"/>
+                    </a:xfrm>
+                    <a:prstGeom prst="rect">
+                      <a:avLst/>
+                    </a:prstGeom>
+                  </pic:spPr>
+                </pic:pic>
+              </a:graphicData>
+            </a:graphic>
+          </wp:inline>
+        </w:drawing>
+      </w:r>
     </w:p>
     <w:p>
       <w:pPr>
@@ -3190,7 +3617,6 @@
           <w:bCs/>
           <w:lang w:val="es-EC"/>
         </w:rPr>
-        <w:lastRenderedPageBreak/>
         <w:t>Construcción de Imágenes</w:t>
       </w:r>
       <w:r>
@@ -3251,6 +3677,7 @@
           <w:bCs/>
           <w:lang w:val="es-EC"/>
         </w:rPr>
+        <w:lastRenderedPageBreak/>
         <w:t>Configuración de Proxy Inverso</w:t>
       </w:r>
       <w:r>
@@ -3603,7 +4030,6 @@
         <w:rPr>
           <w:lang w:val="es-EC"/>
         </w:rPr>
-        <w:lastRenderedPageBreak/>
         <w:t>Esta categoría es fundamental para asegurar la integridad de las transacciones y permitir que el esquema de datos evolucione de manera flexible ante nuevos requerimientos funcionales.</w:t>
       </w:r>
     </w:p>
@@ -3648,6 +4074,7 @@
         <w:rPr>
           <w:lang w:val="es-EC"/>
         </w:rPr>
+        <w:lastRenderedPageBreak/>
         <w:t>Mongoose</w:t>
       </w:r>
     </w:p>
@@ -4035,7 +4462,6 @@
           <w:bCs/>
           <w:lang w:val="es-EC"/>
         </w:rPr>
-        <w:lastRenderedPageBreak/>
         <w:t>Degradación del Rendimiento</w:t>
       </w:r>
       <w:r>
@@ -4096,6 +4522,7 @@
           <w:bCs/>
           <w:lang w:val="es-EC"/>
         </w:rPr>
+        <w:lastRenderedPageBreak/>
         <w:t>Fallo de Orquestación</w:t>
       </w:r>
       <w:r>
@@ -4334,14 +4761,14 @@
         <w:rPr>
           <w:b/>
           <w:bCs/>
-          <w:lang w:val="es-EC"/>
-        </w:rPr>
-      </w:pPr>
-      <w:r>
-        <w:rPr>
-          <w:b/>
-          <w:bCs/>
-          <w:lang w:val="es-EC"/>
+          <w:lang w:val="pt-PT"/>
+        </w:rPr>
+      </w:pPr>
+      <w:r>
+        <w:rPr>
+          <w:b/>
+          <w:bCs/>
+          <w:lang w:val="pt-PT"/>
         </w:rPr>
         <w:t>8. ANEXOS</w:t>
       </w:r>
@@ -4350,28 +4777,28 @@
       <w:pPr>
         <w:ind w:left="708"/>
         <w:rPr>
-          <w:lang w:val="es-EC"/>
-        </w:rPr>
-      </w:pPr>
-      <w:r>
-        <w:rPr>
-          <w:b/>
-          <w:bCs/>
-          <w:lang w:val="es-EC"/>
+          <w:lang w:val="pt-PT"/>
+        </w:rPr>
+      </w:pPr>
+      <w:r>
+        <w:rPr>
+          <w:b/>
+          <w:bCs/>
+          <w:lang w:val="pt-PT"/>
         </w:rPr>
         <w:t>REPOSITORIO:</w:t>
       </w:r>
       <w:r>
         <w:rPr>
-          <w:lang w:val="es-EC"/>
+          <w:lang w:val="pt-PT"/>
         </w:rPr>
         <w:t xml:space="preserve"> </w:t>
       </w:r>
-      <w:hyperlink r:id="rId8" w:history="1">
+      <w:hyperlink r:id="rId16" w:history="1">
         <w:r>
           <w:rPr>
             <w:rStyle w:val="Hipervnculo"/>
-            <w:lang w:val="es-EC"/>
+            <w:lang w:val="pt-PT"/>
           </w:rPr>
           <w:t>https://github.com/JohannCaizaguano/Recuperacion</w:t>
         </w:r>
@@ -4381,7 +4808,7 @@
       <w:pPr>
         <w:ind w:left="708"/>
         <w:rPr>
-          <w:lang w:val="es-EC"/>
+          <w:lang w:val="pt-PT"/>
         </w:rPr>
       </w:pPr>
     </w:p>
@@ -4389,7 +4816,7 @@
       <w:pPr>
         <w:ind w:left="708"/>
         <w:rPr>
-          <w:lang w:val="es-EC"/>
+          <w:lang w:val="pt-PT"/>
         </w:rPr>
       </w:pPr>
     </w:p>
@@ -4397,7 +4824,7 @@
       <w:pPr>
         <w:ind w:left="708"/>
         <w:rPr>
-          <w:lang w:val="es-EC"/>
+          <w:lang w:val="pt-PT"/>
         </w:rPr>
       </w:pPr>
     </w:p>
@@ -4405,7 +4832,7 @@
       <w:pPr>
         <w:ind w:left="708"/>
         <w:rPr>
-          <w:lang w:val="es-EC"/>
+          <w:lang w:val="pt-PT"/>
         </w:rPr>
       </w:pPr>
     </w:p>
@@ -4413,7 +4840,7 @@
       <w:pPr>
         <w:ind w:left="708"/>
         <w:rPr>
-          <w:lang w:val="es-EC"/>
+          <w:lang w:val="pt-PT"/>
         </w:rPr>
       </w:pPr>
     </w:p>
@@ -4421,7 +4848,7 @@
       <w:pPr>
         <w:ind w:left="708"/>
         <w:rPr>
-          <w:lang w:val="es-EC"/>
+          <w:lang w:val="pt-PT"/>
         </w:rPr>
       </w:pPr>
     </w:p>
@@ -4429,23 +4856,72 @@
       <w:pPr>
         <w:ind w:left="708"/>
         <w:rPr>
-          <w:lang w:val="es-EC"/>
-        </w:rPr>
-      </w:pPr>
-    </w:p>
-    <w:p>
-      <w:pPr>
-        <w:rPr>
-          <w:b/>
-          <w:bCs/>
-          <w:lang w:val="es-EC"/>
-        </w:rPr>
-      </w:pPr>
-      <w:r>
-        <w:rPr>
-          <w:b/>
-          <w:bCs/>
-        </w:rPr>
+          <w:lang w:val="pt-PT"/>
+        </w:rPr>
+      </w:pPr>
+    </w:p>
+    <w:p>
+      <w:pPr>
+        <w:ind w:left="708"/>
+        <w:rPr>
+          <w:lang w:val="pt-PT"/>
+        </w:rPr>
+      </w:pPr>
+    </w:p>
+    <w:p>
+      <w:pPr>
+        <w:ind w:left="708"/>
+        <w:rPr>
+          <w:lang w:val="pt-PT"/>
+        </w:rPr>
+      </w:pPr>
+    </w:p>
+    <w:p>
+      <w:pPr>
+        <w:ind w:left="708"/>
+        <w:rPr>
+          <w:lang w:val="pt-PT"/>
+        </w:rPr>
+      </w:pPr>
+    </w:p>
+    <w:p>
+      <w:pPr>
+        <w:ind w:left="708"/>
+        <w:rPr>
+          <w:lang w:val="pt-PT"/>
+        </w:rPr>
+      </w:pPr>
+    </w:p>
+    <w:p>
+      <w:pPr>
+        <w:ind w:left="708"/>
+        <w:rPr>
+          <w:lang w:val="pt-PT"/>
+        </w:rPr>
+      </w:pPr>
+    </w:p>
+    <w:p>
+      <w:pPr>
+        <w:ind w:left="708"/>
+        <w:rPr>
+          <w:lang w:val="pt-PT"/>
+        </w:rPr>
+      </w:pPr>
+    </w:p>
+    <w:p>
+      <w:pPr>
+        <w:rPr>
+          <w:b/>
+          <w:bCs/>
+          <w:lang w:val="es-EC"/>
+        </w:rPr>
+      </w:pPr>
+      <w:r>
+        <w:rPr>
+          <w:b/>
+          <w:bCs/>
+        </w:rPr>
+        <w:lastRenderedPageBreak/>
         <w:t xml:space="preserve">9. </w:t>
       </w:r>
       <w:r>
@@ -4493,7 +4969,6 @@
         <w:rPr>
           <w:lang w:val="es-EC"/>
         </w:rPr>
-        <w:lastRenderedPageBreak/>
         <w:t>La ejecución del mantenimiento correctivo en los controladores de transacciones y pedidos permitió subsanar fallas de lógica que comprometían la integridad del inventario, asegurando una sincronización atómica entre las operaciones del cliente y la persistencia en la base de datos NoSQL.</w:t>
       </w:r>
     </w:p>

</xml_diff>